<commit_message>
Alterado a seção de habilidades.
</commit_message>
<xml_diff>
--- a/Maruhan Diego Zandonai.docx
+++ b/Maruhan Diego Zandonai.docx
@@ -1,6 +1,6 @@
 
 <file path=word/document.xml><?xml version="1.0" encoding="utf-8"?>
-<w:document xmlns:wpc="http://schemas.microsoft.com/office/word/2010/wordprocessingCanvas" xmlns:cx="http://schemas.microsoft.com/office/drawing/2014/chartex" xmlns:cx1="http://schemas.microsoft.com/office/drawing/2015/9/8/chartex" xmlns:cx2="http://schemas.microsoft.com/office/drawing/2015/10/21/chartex" xmlns:cx3="http://schemas.microsoft.com/office/drawing/2016/5/9/chartex" xmlns:cx4="http://schemas.microsoft.com/office/drawing/2016/5/10/chartex" xmlns:cx5="http://schemas.microsoft.com/office/drawing/2016/5/11/chartex" xmlns:cx6="http://schemas.microsoft.com/office/drawing/2016/5/12/chartex" xmlns:cx7="http://schemas.microsoft.com/office/drawing/2016/5/13/chartex" xmlns:cx8="http://schemas.microsoft.com/office/drawing/2016/5/14/chartex" xmlns:mc="http://schemas.openxmlformats.org/markup-compatibility/2006" xmlns:aink="http://schemas.microsoft.com/office/drawing/2016/ink" xmlns:am3d="http://schemas.microsoft.com/office/drawing/2017/model3d" xmlns:o="urn:schemas-microsoft-com:office:office" xmlns:r="http://schemas.openxmlformats.org/officeDocument/2006/relationships" xmlns:m="http://schemas.openxmlformats.org/officeDocument/2006/math" xmlns:v="urn:schemas-microsoft-com:vml" xmlns:wp14="http://schemas.microsoft.com/office/word/2010/wordprocessingDrawing" xmlns:wp="http://schemas.openxmlformats.org/drawingml/2006/wordprocessingDrawing" xmlns:w10="urn:schemas-microsoft-com:office:word" xmlns:w="http://schemas.openxmlformats.org/wordprocessingml/2006/main" xmlns:w14="http://schemas.microsoft.com/office/word/2010/wordml" xmlns:w15="http://schemas.microsoft.com/office/word/2012/wordml" xmlns:w16cex="http://schemas.microsoft.com/office/word/2018/wordml/cex" xmlns:w16cid="http://schemas.microsoft.com/office/word/2016/wordml/cid" xmlns:w16="http://schemas.microsoft.com/office/word/2018/wordml" xmlns:w16sdtdh="http://schemas.microsoft.com/office/word/2020/wordml/sdtdatahash" xmlns:w16se="http://schemas.microsoft.com/office/word/2015/wordml/symex" xmlns:wpg="http://schemas.microsoft.com/office/word/2010/wordprocessingGroup" xmlns:wpi="http://schemas.microsoft.com/office/word/2010/wordprocessingInk" xmlns:wne="http://schemas.microsoft.com/office/word/2006/wordml" xmlns:wps="http://schemas.microsoft.com/office/word/2010/wordprocessingShape" mc:Ignorable="w14 w15 w16se w16cid w16 w16cex w16sdtdh wp14">
+<w:document xmlns:wpc="http://schemas.microsoft.com/office/word/2010/wordprocessingCanvas" xmlns:cx="http://schemas.microsoft.com/office/drawing/2014/chartex" xmlns:cx1="http://schemas.microsoft.com/office/drawing/2015/9/8/chartex" xmlns:cx2="http://schemas.microsoft.com/office/drawing/2015/10/21/chartex" xmlns:cx3="http://schemas.microsoft.com/office/drawing/2016/5/9/chartex" xmlns:cx4="http://schemas.microsoft.com/office/drawing/2016/5/10/chartex" xmlns:cx5="http://schemas.microsoft.com/office/drawing/2016/5/11/chartex" xmlns:cx6="http://schemas.microsoft.com/office/drawing/2016/5/12/chartex" xmlns:cx7="http://schemas.microsoft.com/office/drawing/2016/5/13/chartex" xmlns:cx8="http://schemas.microsoft.com/office/drawing/2016/5/14/chartex" xmlns:mc="http://schemas.openxmlformats.org/markup-compatibility/2006" xmlns:aink="http://schemas.microsoft.com/office/drawing/2016/ink" xmlns:am3d="http://schemas.microsoft.com/office/drawing/2017/model3d" xmlns:o="urn:schemas-microsoft-com:office:office" xmlns:oel="http://schemas.microsoft.com/office/2019/extlst" xmlns:r="http://schemas.openxmlformats.org/officeDocument/2006/relationships" xmlns:m="http://schemas.openxmlformats.org/officeDocument/2006/math" xmlns:v="urn:schemas-microsoft-com:vml" xmlns:wp14="http://schemas.microsoft.com/office/word/2010/wordprocessingDrawing" xmlns:wp="http://schemas.openxmlformats.org/drawingml/2006/wordprocessingDrawing" xmlns:w10="urn:schemas-microsoft-com:office:word" xmlns:w="http://schemas.openxmlformats.org/wordprocessingml/2006/main" xmlns:w14="http://schemas.microsoft.com/office/word/2010/wordml" xmlns:w15="http://schemas.microsoft.com/office/word/2012/wordml" xmlns:w16cex="http://schemas.microsoft.com/office/word/2018/wordml/cex" xmlns:w16cid="http://schemas.microsoft.com/office/word/2016/wordml/cid" xmlns:w16="http://schemas.microsoft.com/office/word/2018/wordml" xmlns:w16du="http://schemas.microsoft.com/office/word/2023/wordml/word16du" xmlns:w16sdtdh="http://schemas.microsoft.com/office/word/2020/wordml/sdtdatahash" xmlns:w16sdtfl="http://schemas.microsoft.com/office/word/2024/wordml/sdtformatlock" xmlns:w16se="http://schemas.microsoft.com/office/word/2015/wordml/symex" xmlns:wpg="http://schemas.microsoft.com/office/word/2010/wordprocessingGroup" xmlns:wpi="http://schemas.microsoft.com/office/word/2010/wordprocessingInk" xmlns:wne="http://schemas.microsoft.com/office/word/2006/wordml" xmlns:wps="http://schemas.microsoft.com/office/word/2010/wordprocessingShape" mc:Ignorable="w14 w15 w16se w16cid w16 w16cex w16sdtdh w16sdtfl w16du wp14">
   <w:body>
     <w:tbl>
       <w:tblPr>
@@ -617,13 +617,7 @@
               <w:rPr>
                 <w:lang w:val="pt-BR"/>
               </w:rPr>
-              <w:t>Universidade Federal de Santa Catarian</w:t>
-            </w:r>
-            <w:r>
-              <w:rPr>
-                <w:lang w:val="pt-BR"/>
-              </w:rPr>
-              <w:t>a</w:t>
+              <w:t>Universidade Federal de Santa Catariana</w:t>
             </w:r>
           </w:p>
           <w:p>
@@ -675,9 +669,15 @@
       </w:tr>
     </w:tbl>
     <w:p>
+      <w:pPr>
+        <w:rPr>
+          <w:lang w:val="pt-BR"/>
+        </w:rPr>
+      </w:pPr>
       <w:r>
         <w:rPr>
           <w:caps/>
+          <w:lang w:val="pt-BR"/>
         </w:rPr>
         <w:br w:type="page"/>
       </w:r>
@@ -815,19 +815,7 @@
               <w:rPr>
                 <w:lang w:val="pt-BR"/>
               </w:rPr>
-              <w:t>Inglês: Nível C</w:t>
-            </w:r>
-            <w:r>
-              <w:rPr>
-                <w:lang w:val="pt-BR"/>
-              </w:rPr>
-              <w:t xml:space="preserve">1: </w:t>
-            </w:r>
-            <w:r>
-              <w:rPr>
-                <w:lang w:val="pt-BR"/>
-              </w:rPr>
-              <w:t>Entende e fala muito bem</w:t>
+              <w:t>Inglês: Nível C1: Entende e fala muito bem</w:t>
             </w:r>
             <w:r>
               <w:rPr>
@@ -905,6 +893,321 @@
               <w:t>Pensamento crítico aplicado a decisões de projeto.</w:t>
             </w:r>
           </w:p>
+          <w:p>
+            <w:pPr>
+              <w:pStyle w:val="ListBullet"/>
+              <w:rPr>
+                <w:lang w:val="pt-BR"/>
+              </w:rPr>
+            </w:pPr>
+            <w:r>
+              <w:rPr>
+                <w:lang w:val="pt-BR"/>
+              </w:rPr>
+              <w:t>Experiência no desenvolvimento de sistemas de controle voltados para a área de saneamento (controle de vazão, nível, pressão e concentração de produtos químicos), incluindo sistemas com atraso.</w:t>
+            </w:r>
+          </w:p>
+          <w:p>
+            <w:pPr>
+              <w:pStyle w:val="ListBullet"/>
+              <w:numPr>
+                <w:ilvl w:val="0"/>
+                <w:numId w:val="0"/>
+              </w:numPr>
+              <w:ind w:left="360"/>
+              <w:rPr>
+                <w:lang w:val="pt-BR"/>
+              </w:rPr>
+            </w:pPr>
+          </w:p>
+          <w:p>
+            <w:pPr>
+              <w:pStyle w:val="ListBullet"/>
+              <w:rPr>
+                <w:lang w:val="pt-BR"/>
+              </w:rPr>
+            </w:pPr>
+            <w:r>
+              <w:rPr>
+                <w:lang w:val="pt-BR"/>
+              </w:rPr>
+              <w:t>Experiência no desenvolvimento de bibliotecas para controladores baseados em CODESYS.</w:t>
+            </w:r>
+          </w:p>
+          <w:p>
+            <w:pPr>
+              <w:pStyle w:val="ListBullet"/>
+              <w:numPr>
+                <w:ilvl w:val="0"/>
+                <w:numId w:val="0"/>
+              </w:numPr>
+              <w:ind w:left="360"/>
+              <w:rPr>
+                <w:lang w:val="pt-BR"/>
+              </w:rPr>
+            </w:pPr>
+          </w:p>
+          <w:p>
+            <w:pPr>
+              <w:pStyle w:val="ListBullet"/>
+              <w:rPr>
+                <w:lang w:val="pt-BR"/>
+              </w:rPr>
+            </w:pPr>
+            <w:r>
+              <w:rPr>
+                <w:lang w:val="pt-BR"/>
+              </w:rPr>
+              <w:t xml:space="preserve">Conhecimento em redes industriais, com entendimento do funcionamento e implementação de protocolos como Modbus, MQTT e </w:t>
+            </w:r>
+            <w:proofErr w:type="spellStart"/>
+            <w:r>
+              <w:rPr>
+                <w:lang w:val="pt-BR"/>
+              </w:rPr>
+              <w:t>Profinet</w:t>
+            </w:r>
+            <w:proofErr w:type="spellEnd"/>
+            <w:r>
+              <w:rPr>
+                <w:lang w:val="pt-BR"/>
+              </w:rPr>
+              <w:t>.</w:t>
+            </w:r>
+          </w:p>
+          <w:p>
+            <w:pPr>
+              <w:pStyle w:val="ListBullet"/>
+              <w:numPr>
+                <w:ilvl w:val="0"/>
+                <w:numId w:val="0"/>
+              </w:numPr>
+              <w:ind w:left="360"/>
+              <w:rPr>
+                <w:lang w:val="pt-BR"/>
+              </w:rPr>
+            </w:pPr>
+          </w:p>
+          <w:p>
+            <w:pPr>
+              <w:pStyle w:val="ListBullet"/>
+              <w:rPr>
+                <w:lang w:val="pt-BR"/>
+              </w:rPr>
+            </w:pPr>
+            <w:r>
+              <w:rPr>
+                <w:lang w:val="pt-BR"/>
+              </w:rPr>
+              <w:t xml:space="preserve">Experiência com linguagens de alto nível como Python (pandas, </w:t>
+            </w:r>
+            <w:proofErr w:type="spellStart"/>
+            <w:r>
+              <w:rPr>
+                <w:lang w:val="pt-BR"/>
+              </w:rPr>
+              <w:t>tkinter</w:t>
+            </w:r>
+            <w:proofErr w:type="spellEnd"/>
+            <w:r>
+              <w:rPr>
+                <w:lang w:val="pt-BR"/>
+              </w:rPr>
+              <w:t xml:space="preserve">, </w:t>
+            </w:r>
+            <w:proofErr w:type="spellStart"/>
+            <w:r>
+              <w:rPr>
+                <w:lang w:val="pt-BR"/>
+              </w:rPr>
+              <w:t>matplotlib</w:t>
+            </w:r>
+            <w:proofErr w:type="spellEnd"/>
+            <w:r>
+              <w:rPr>
+                <w:lang w:val="pt-BR"/>
+              </w:rPr>
+              <w:t xml:space="preserve">, </w:t>
+            </w:r>
+            <w:proofErr w:type="spellStart"/>
+            <w:r>
+              <w:rPr>
+                <w:lang w:val="pt-BR"/>
+              </w:rPr>
+              <w:t>signals</w:t>
+            </w:r>
+            <w:proofErr w:type="spellEnd"/>
+            <w:r>
+              <w:rPr>
+                <w:lang w:val="pt-BR"/>
+              </w:rPr>
+              <w:t xml:space="preserve">, open-cv), Node-RED, MATLAB, </w:t>
+            </w:r>
+            <w:proofErr w:type="spellStart"/>
+            <w:r>
+              <w:rPr>
+                <w:lang w:val="pt-BR"/>
+              </w:rPr>
+              <w:t>Simulink</w:t>
+            </w:r>
+            <w:proofErr w:type="spellEnd"/>
+            <w:r>
+              <w:rPr>
+                <w:lang w:val="pt-BR"/>
+              </w:rPr>
+              <w:t xml:space="preserve"> e </w:t>
+            </w:r>
+            <w:proofErr w:type="spellStart"/>
+            <w:r>
+              <w:rPr>
+                <w:lang w:val="pt-BR"/>
+              </w:rPr>
+              <w:t>LabVIEW</w:t>
+            </w:r>
+            <w:proofErr w:type="spellEnd"/>
+            <w:r>
+              <w:rPr>
+                <w:lang w:val="pt-BR"/>
+              </w:rPr>
+              <w:t>.</w:t>
+            </w:r>
+          </w:p>
+          <w:p>
+            <w:pPr>
+              <w:pStyle w:val="ListBullet"/>
+              <w:numPr>
+                <w:ilvl w:val="0"/>
+                <w:numId w:val="0"/>
+              </w:numPr>
+              <w:ind w:left="360"/>
+              <w:rPr>
+                <w:lang w:val="pt-BR"/>
+              </w:rPr>
+            </w:pPr>
+          </w:p>
+          <w:p>
+            <w:pPr>
+              <w:pStyle w:val="ListBullet"/>
+              <w:rPr>
+                <w:lang w:val="pt-BR"/>
+              </w:rPr>
+            </w:pPr>
+            <w:r>
+              <w:rPr>
+                <w:lang w:val="pt-BR"/>
+              </w:rPr>
+              <w:t xml:space="preserve">Noções básicas de automações </w:t>
+            </w:r>
+            <w:proofErr w:type="spellStart"/>
+            <w:r>
+              <w:rPr>
+                <w:lang w:val="pt-BR"/>
+              </w:rPr>
+              <w:t>low-code</w:t>
+            </w:r>
+            <w:proofErr w:type="spellEnd"/>
+            <w:r>
+              <w:rPr>
+                <w:lang w:val="pt-BR"/>
+              </w:rPr>
+              <w:t xml:space="preserve"> (Power Apps, Power </w:t>
+            </w:r>
+            <w:proofErr w:type="spellStart"/>
+            <w:r>
+              <w:rPr>
+                <w:lang w:val="pt-BR"/>
+              </w:rPr>
+              <w:t>Automate</w:t>
+            </w:r>
+            <w:proofErr w:type="spellEnd"/>
+            <w:r>
+              <w:rPr>
+                <w:lang w:val="pt-BR"/>
+              </w:rPr>
+              <w:t xml:space="preserve">, </w:t>
+            </w:r>
+            <w:proofErr w:type="spellStart"/>
+            <w:r>
+              <w:rPr>
+                <w:lang w:val="pt-BR"/>
+              </w:rPr>
+              <w:t>Flows</w:t>
+            </w:r>
+            <w:proofErr w:type="spellEnd"/>
+            <w:r>
+              <w:rPr>
+                <w:lang w:val="pt-BR"/>
+              </w:rPr>
+              <w:t>).</w:t>
+            </w:r>
+          </w:p>
+          <w:p>
+            <w:pPr>
+              <w:pStyle w:val="ListBullet"/>
+              <w:numPr>
+                <w:ilvl w:val="0"/>
+                <w:numId w:val="0"/>
+              </w:numPr>
+              <w:rPr>
+                <w:lang w:val="pt-BR"/>
+              </w:rPr>
+            </w:pPr>
+          </w:p>
+          <w:p>
+            <w:pPr>
+              <w:pStyle w:val="ListBullet"/>
+              <w:rPr>
+                <w:lang w:val="pt-BR"/>
+              </w:rPr>
+            </w:pPr>
+            <w:r>
+              <w:rPr>
+                <w:lang w:val="pt-BR"/>
+              </w:rPr>
+              <w:t xml:space="preserve">Familiaridade com prototipagem de placas de circuito impresso (PCB) utilizando o software </w:t>
+            </w:r>
+            <w:proofErr w:type="spellStart"/>
+            <w:r>
+              <w:rPr>
+                <w:lang w:val="pt-BR"/>
+              </w:rPr>
+              <w:t>EasyEDA</w:t>
+            </w:r>
+            <w:proofErr w:type="spellEnd"/>
+            <w:r>
+              <w:rPr>
+                <w:lang w:val="pt-BR"/>
+              </w:rPr>
+              <w:t>.</w:t>
+            </w:r>
+          </w:p>
+          <w:p>
+            <w:pPr>
+              <w:pStyle w:val="ListBullet"/>
+              <w:numPr>
+                <w:ilvl w:val="0"/>
+                <w:numId w:val="0"/>
+              </w:numPr>
+              <w:ind w:left="360"/>
+              <w:rPr>
+                <w:lang w:val="pt-BR"/>
+              </w:rPr>
+            </w:pPr>
+          </w:p>
+          <w:p>
+            <w:pPr>
+              <w:pStyle w:val="ListBullet"/>
+              <w:rPr>
+                <w:lang w:val="pt-BR"/>
+              </w:rPr>
+            </w:pPr>
+            <w:r>
+              <w:rPr>
+                <w:lang w:val="pt-BR"/>
+              </w:rPr>
+              <w:t>Trabalho em equipe</w:t>
+            </w:r>
+          </w:p>
         </w:tc>
         <w:tc>
           <w:tcPr>
@@ -927,33 +1230,18 @@
               <w:t>Bom entendimento de sistemas elétricos industriais.</w:t>
             </w:r>
           </w:p>
-        </w:tc>
-      </w:tr>
-      <w:tr>
-        <w:trPr>
-          <w:trHeight w:val="658"/>
-        </w:trPr>
-        <w:tc>
-          <w:tcPr>
-            <w:tcW w:w="5040" w:type="dxa"/>
-            <w:tcBorders>
-              <w:top w:val="single" w:sz="24" w:space="0" w:color="ACA8AA" w:themeColor="accent4"/>
-              <w:bottom w:val="single" w:sz="24" w:space="0" w:color="ACA8AA" w:themeColor="accent4"/>
-            </w:tcBorders>
-          </w:tcPr>
           <w:p>
             <w:pPr>
               <w:pStyle w:val="ListBullet"/>
-              <w:rPr>
-                <w:lang w:val="pt-BR"/>
-              </w:rPr>
-            </w:pPr>
-            <w:r>
-              <w:rPr>
-                <w:lang w:val="pt-BR"/>
-              </w:rPr>
-              <w:t>Experiência no desenvolvimento de sistemas de controle voltados para a área de saneamento (controle de vazão, nível, pressão e concentração de produtos químicos), incluindo sistemas com atraso.</w:t>
-            </w:r>
+              <w:numPr>
+                <w:ilvl w:val="0"/>
+                <w:numId w:val="0"/>
+              </w:numPr>
+              <w:ind w:left="360"/>
+              <w:rPr>
+                <w:lang w:val="pt-BR"/>
+              </w:rPr>
+            </w:pPr>
           </w:p>
           <w:p>
             <w:pPr>
@@ -966,87 +1254,130 @@
               <w:rPr>
                 <w:lang w:val="pt-BR"/>
               </w:rPr>
-              <w:t>Experiência no desenvolvimento de bibliotecas para controladores baseados em CODESYS.</w:t>
+              <w:t xml:space="preserve">Experiência em programação de controladores industriais de alta confiabilidade, utilizando linguagens conforme a necessidade da aplicação (ST, SCL, SFC e </w:t>
+            </w:r>
+            <w:proofErr w:type="spellStart"/>
+            <w:r>
+              <w:rPr>
+                <w:lang w:val="pt-BR"/>
+              </w:rPr>
+              <w:t>Ladder</w:t>
+            </w:r>
+            <w:proofErr w:type="spellEnd"/>
+            <w:r>
+              <w:rPr>
+                <w:lang w:val="pt-BR"/>
+              </w:rPr>
+              <w:t>).</w:t>
             </w:r>
           </w:p>
           <w:p>
             <w:pPr>
               <w:pStyle w:val="ListBullet"/>
-              <w:rPr>
-                <w:lang w:val="pt-BR"/>
-              </w:rPr>
-            </w:pPr>
-            <w:r>
-              <w:rPr>
-                <w:lang w:val="pt-BR"/>
-              </w:rPr>
-              <w:t xml:space="preserve">Conhecimento em redes industriais, com entendimento do funcionamento e implementação de protocolos como </w:t>
+              <w:numPr>
+                <w:ilvl w:val="0"/>
+                <w:numId w:val="0"/>
+              </w:numPr>
+              <w:rPr>
+                <w:lang w:val="pt-BR"/>
+              </w:rPr>
+            </w:pPr>
+          </w:p>
+          <w:p>
+            <w:pPr>
+              <w:pStyle w:val="ListBullet"/>
+              <w:rPr>
+                <w:lang w:val="pt-BR"/>
+              </w:rPr>
+            </w:pPr>
+            <w:r>
+              <w:rPr>
+                <w:lang w:val="pt-BR"/>
+              </w:rPr>
+              <w:t xml:space="preserve">Projeto, desenvolvimento e integração de </w:t>
             </w:r>
             <w:proofErr w:type="spellStart"/>
             <w:r>
               <w:rPr>
                 <w:lang w:val="pt-BR"/>
               </w:rPr>
-              <w:t>Modbus</w:t>
+              <w:t>IHMs</w:t>
             </w:r>
             <w:proofErr w:type="spellEnd"/>
             <w:r>
               <w:rPr>
                 <w:lang w:val="pt-BR"/>
               </w:rPr>
-              <w:t xml:space="preserve">, MQTT e </w:t>
+              <w:t xml:space="preserve"> e sistemas supervisórios em ambientes multiplataforma (Schneider, ABB, Phoenix Contact, Mitsubishi).</w:t>
+            </w:r>
+          </w:p>
+          <w:p>
+            <w:pPr>
+              <w:pStyle w:val="ListBullet"/>
+              <w:numPr>
+                <w:ilvl w:val="0"/>
+                <w:numId w:val="0"/>
+              </w:numPr>
+              <w:ind w:left="360"/>
+              <w:rPr>
+                <w:lang w:val="pt-BR"/>
+              </w:rPr>
+            </w:pPr>
+          </w:p>
+          <w:p>
+            <w:pPr>
+              <w:pStyle w:val="ListBullet"/>
+              <w:rPr>
+                <w:lang w:val="pt-BR"/>
+              </w:rPr>
+            </w:pPr>
+            <w:r>
+              <w:rPr>
+                <w:lang w:val="pt-BR"/>
+              </w:rPr>
+              <w:t xml:space="preserve">Conhecimento no uso de sistemas de aquisição de dados (DAQ), com experiência nas plataformas </w:t>
             </w:r>
             <w:proofErr w:type="spellStart"/>
             <w:r>
               <w:rPr>
                 <w:lang w:val="pt-BR"/>
               </w:rPr>
-              <w:t>Profinet</w:t>
+              <w:t>National</w:t>
             </w:r>
             <w:proofErr w:type="spellEnd"/>
             <w:r>
               <w:rPr>
                 <w:lang w:val="pt-BR"/>
               </w:rPr>
-              <w:t>.</w:t>
-            </w:r>
-          </w:p>
-        </w:tc>
-        <w:tc>
-          <w:tcPr>
-            <w:tcW w:w="5040" w:type="dxa"/>
-            <w:tcBorders>
-              <w:top w:val="single" w:sz="24" w:space="0" w:color="ACA8AA" w:themeColor="accent4"/>
-              <w:bottom w:val="single" w:sz="24" w:space="0" w:color="ACA8AA" w:themeColor="accent4"/>
-            </w:tcBorders>
-          </w:tcPr>
+              <w:t xml:space="preserve"> </w:t>
+            </w:r>
+            <w:proofErr w:type="spellStart"/>
+            <w:r>
+              <w:rPr>
+                <w:lang w:val="pt-BR"/>
+              </w:rPr>
+              <w:t>Instruments</w:t>
+            </w:r>
+            <w:proofErr w:type="spellEnd"/>
+            <w:r>
+              <w:rPr>
+                <w:lang w:val="pt-BR"/>
+              </w:rPr>
+              <w:t xml:space="preserve"> e MCC-DAQ.</w:t>
+            </w:r>
+          </w:p>
           <w:p>
             <w:pPr>
               <w:pStyle w:val="ListBullet"/>
-              <w:rPr>
-                <w:lang w:val="pt-BR"/>
-              </w:rPr>
-            </w:pPr>
-            <w:r>
-              <w:rPr>
-                <w:lang w:val="pt-BR"/>
-              </w:rPr>
-              <w:t xml:space="preserve">Experiência em programação de controladores industriais de alta confiabilidade, utilizando linguagens conforme a necessidade da aplicação (ST, SCL, SFC, </w:t>
-            </w:r>
-            <w:proofErr w:type="spellStart"/>
-            <w:r>
-              <w:rPr>
-                <w:lang w:val="pt-BR"/>
-              </w:rPr>
-              <w:t>Bargraph</w:t>
-            </w:r>
-            <w:proofErr w:type="spellEnd"/>
-            <w:r>
-              <w:rPr>
-                <w:lang w:val="pt-BR"/>
-              </w:rPr>
-              <w:t xml:space="preserve"> e Ladder).</w:t>
-            </w:r>
+              <w:numPr>
+                <w:ilvl w:val="0"/>
+                <w:numId w:val="0"/>
+              </w:numPr>
+              <w:ind w:left="360"/>
+              <w:rPr>
+                <w:lang w:val="pt-BR"/>
+              </w:rPr>
+            </w:pPr>
           </w:p>
           <w:p>
             <w:pPr>
@@ -1059,120 +1390,21 @@
               <w:rPr>
                 <w:lang w:val="pt-BR"/>
               </w:rPr>
-              <w:t xml:space="preserve">Projeto, desenvolvimento e integração de </w:t>
-            </w:r>
-            <w:proofErr w:type="spellStart"/>
-            <w:r>
-              <w:rPr>
-                <w:lang w:val="pt-BR"/>
-              </w:rPr>
-              <w:t>IHMs</w:t>
-            </w:r>
-            <w:proofErr w:type="spellEnd"/>
-            <w:r>
-              <w:rPr>
-                <w:lang w:val="pt-BR"/>
-              </w:rPr>
-              <w:t xml:space="preserve"> e sistemas supervisórios em ambientes multiplataforma (Schneider, ABB, Phoenix </w:t>
-            </w:r>
-            <w:proofErr w:type="spellStart"/>
-            <w:r>
-              <w:rPr>
-                <w:lang w:val="pt-BR"/>
-              </w:rPr>
-              <w:t>Contact</w:t>
-            </w:r>
-            <w:proofErr w:type="spellEnd"/>
-            <w:r>
-              <w:rPr>
-                <w:lang w:val="pt-BR"/>
-              </w:rPr>
-              <w:t>, Mitsubishi).</w:t>
-            </w:r>
-          </w:p>
-        </w:tc>
-      </w:tr>
-      <w:tr>
-        <w:trPr>
-          <w:trHeight w:val="658"/>
-        </w:trPr>
-        <w:tc>
-          <w:tcPr>
-            <w:tcW w:w="5040" w:type="dxa"/>
-            <w:tcBorders>
-              <w:top w:val="single" w:sz="24" w:space="0" w:color="ACA8AA" w:themeColor="accent4"/>
-              <w:bottom w:val="single" w:sz="24" w:space="0" w:color="ACA8AA" w:themeColor="accent4"/>
-            </w:tcBorders>
-          </w:tcPr>
+              <w:t>Experiência em projetos mecânicos, incluindo desenvolvimento de mecanismos e análise de esforços por elementos finitos.</w:t>
+            </w:r>
+          </w:p>
           <w:p>
             <w:pPr>
               <w:pStyle w:val="ListBullet"/>
-              <w:rPr>
-                <w:lang w:val="pt-BR"/>
-              </w:rPr>
-            </w:pPr>
-            <w:r>
-              <w:rPr>
-                <w:lang w:val="pt-BR"/>
-              </w:rPr>
-              <w:t xml:space="preserve">Experiência com linguagens de alto nível como Python (pandas, </w:t>
-            </w:r>
-            <w:proofErr w:type="spellStart"/>
-            <w:r>
-              <w:rPr>
-                <w:lang w:val="pt-BR"/>
-              </w:rPr>
-              <w:t>tkinter</w:t>
-            </w:r>
-            <w:proofErr w:type="spellEnd"/>
-            <w:r>
-              <w:rPr>
-                <w:lang w:val="pt-BR"/>
-              </w:rPr>
-              <w:t xml:space="preserve">, </w:t>
-            </w:r>
-            <w:proofErr w:type="spellStart"/>
-            <w:r>
-              <w:rPr>
-                <w:lang w:val="pt-BR"/>
-              </w:rPr>
-              <w:t>matplotlib</w:t>
-            </w:r>
-            <w:proofErr w:type="spellEnd"/>
-            <w:r>
-              <w:rPr>
-                <w:lang w:val="pt-BR"/>
-              </w:rPr>
-              <w:t xml:space="preserve">, </w:t>
-            </w:r>
-            <w:proofErr w:type="spellStart"/>
-            <w:r>
-              <w:rPr>
-                <w:lang w:val="pt-BR"/>
-              </w:rPr>
-              <w:t>control</w:t>
-            </w:r>
-            <w:proofErr w:type="spellEnd"/>
-            <w:r>
-              <w:rPr>
-                <w:lang w:val="pt-BR"/>
-              </w:rPr>
-              <w:t xml:space="preserve">, open-cv), Node-RED, MATLAB, Simulink e </w:t>
-            </w:r>
-            <w:proofErr w:type="spellStart"/>
-            <w:r>
-              <w:rPr>
-                <w:lang w:val="pt-BR"/>
-              </w:rPr>
-              <w:t>LabVIEW</w:t>
-            </w:r>
-            <w:proofErr w:type="spellEnd"/>
-            <w:r>
-              <w:rPr>
-                <w:lang w:val="pt-BR"/>
-              </w:rPr>
-              <w:t>.</w:t>
-            </w:r>
+              <w:numPr>
+                <w:ilvl w:val="0"/>
+                <w:numId w:val="0"/>
+              </w:numPr>
+              <w:ind w:left="360"/>
+              <w:rPr>
+                <w:lang w:val="pt-BR"/>
+              </w:rPr>
+            </w:pPr>
           </w:p>
           <w:p>
             <w:pPr>
@@ -1185,78 +1417,20 @@
               <w:rPr>
                 <w:lang w:val="pt-BR"/>
               </w:rPr>
-              <w:t xml:space="preserve">Noções básicas de automações </w:t>
-            </w:r>
-            <w:proofErr w:type="spellStart"/>
-            <w:r>
-              <w:rPr>
-                <w:lang w:val="pt-BR"/>
-              </w:rPr>
-              <w:t>low-code</w:t>
-            </w:r>
-            <w:proofErr w:type="spellEnd"/>
-            <w:r>
-              <w:rPr>
-                <w:lang w:val="pt-BR"/>
-              </w:rPr>
-              <w:t xml:space="preserve"> (Power Apps, Power </w:t>
-            </w:r>
-            <w:proofErr w:type="spellStart"/>
-            <w:r>
-              <w:rPr>
-                <w:lang w:val="pt-BR"/>
-              </w:rPr>
-              <w:t>Automate</w:t>
-            </w:r>
-            <w:proofErr w:type="spellEnd"/>
-            <w:r>
-              <w:rPr>
-                <w:lang w:val="pt-BR"/>
-              </w:rPr>
-              <w:t xml:space="preserve">, </w:t>
-            </w:r>
-            <w:proofErr w:type="spellStart"/>
-            <w:r>
-              <w:rPr>
-                <w:lang w:val="pt-BR"/>
-              </w:rPr>
-              <w:t>Flows</w:t>
-            </w:r>
-            <w:proofErr w:type="spellEnd"/>
-            <w:r>
-              <w:rPr>
-                <w:lang w:val="pt-BR"/>
-              </w:rPr>
-              <w:t>).</w:t>
+              <w:t>Familiaridade com o pacote Office.</w:t>
             </w:r>
           </w:p>
           <w:p>
             <w:pPr>
               <w:pStyle w:val="ListBullet"/>
-              <w:rPr>
-                <w:lang w:val="pt-BR"/>
-              </w:rPr>
-            </w:pPr>
-            <w:r>
-              <w:rPr>
-                <w:lang w:val="pt-BR"/>
-              </w:rPr>
-              <w:t xml:space="preserve">Familiaridade com prototipagem de placas de circuito impresso (PCB) utilizando o software </w:t>
-            </w:r>
-            <w:proofErr w:type="spellStart"/>
-            <w:r>
-              <w:rPr>
-                <w:lang w:val="pt-BR"/>
-              </w:rPr>
-              <w:t>EasyEDA</w:t>
-            </w:r>
-            <w:proofErr w:type="spellEnd"/>
-            <w:r>
-              <w:rPr>
-                <w:lang w:val="pt-BR"/>
-              </w:rPr>
-              <w:t>.</w:t>
-            </w:r>
+              <w:numPr>
+                <w:ilvl w:val="0"/>
+                <w:numId w:val="0"/>
+              </w:numPr>
+              <w:rPr>
+                <w:lang w:val="pt-BR"/>
+              </w:rPr>
+            </w:pPr>
           </w:p>
           <w:p>
             <w:pPr>
@@ -1269,101 +1443,29 @@
               <w:rPr>
                 <w:lang w:val="pt-BR"/>
               </w:rPr>
-              <w:t>Trabalho em equipe</w:t>
-            </w:r>
-          </w:p>
-        </w:tc>
-        <w:tc>
-          <w:tcPr>
-            <w:tcW w:w="5040" w:type="dxa"/>
-            <w:tcBorders>
-              <w:top w:val="single" w:sz="24" w:space="0" w:color="ACA8AA" w:themeColor="accent4"/>
-              <w:bottom w:val="single" w:sz="24" w:space="0" w:color="ACA8AA" w:themeColor="accent4"/>
-            </w:tcBorders>
-          </w:tcPr>
+              <w:t>Bom entendimento e hábito do uso da ferramenta de versionamento GIT.</w:t>
+            </w:r>
+          </w:p>
+          <w:p>
+            <w:pPr>
+              <w:pStyle w:val="ListParagraph"/>
+              <w:rPr>
+                <w:lang w:val="pt-BR"/>
+              </w:rPr>
+            </w:pPr>
+          </w:p>
           <w:p>
             <w:pPr>
               <w:pStyle w:val="ListBullet"/>
-              <w:rPr>
-                <w:lang w:val="pt-BR"/>
-              </w:rPr>
-            </w:pPr>
-            <w:r>
-              <w:rPr>
-                <w:lang w:val="pt-BR"/>
-              </w:rPr>
-              <w:t xml:space="preserve">Conhecimento no uso de sistemas de aquisição de dados (DAQ), com experiência nas plataformas </w:t>
-            </w:r>
-            <w:proofErr w:type="spellStart"/>
-            <w:r>
-              <w:rPr>
-                <w:lang w:val="pt-BR"/>
-              </w:rPr>
-              <w:t>National</w:t>
-            </w:r>
-            <w:proofErr w:type="spellEnd"/>
-            <w:r>
-              <w:rPr>
-                <w:lang w:val="pt-BR"/>
-              </w:rPr>
-              <w:t xml:space="preserve"> </w:t>
-            </w:r>
-            <w:proofErr w:type="spellStart"/>
-            <w:r>
-              <w:rPr>
-                <w:lang w:val="pt-BR"/>
-              </w:rPr>
-              <w:t>Instruments</w:t>
-            </w:r>
-            <w:proofErr w:type="spellEnd"/>
-            <w:r>
-              <w:rPr>
-                <w:lang w:val="pt-BR"/>
-              </w:rPr>
-              <w:t xml:space="preserve"> e MCC-DAQ.</w:t>
-            </w:r>
-          </w:p>
-          <w:p>
-            <w:pPr>
-              <w:pStyle w:val="ListBullet"/>
-              <w:rPr>
-                <w:lang w:val="pt-BR"/>
-              </w:rPr>
-            </w:pPr>
-            <w:r>
-              <w:rPr>
-                <w:lang w:val="pt-BR"/>
-              </w:rPr>
-              <w:t>Experiência em projetos mecânicos, incluindo desenvolvimento de mecanismos e análise de esforços por elementos finitos.</w:t>
-            </w:r>
-          </w:p>
-          <w:p>
-            <w:pPr>
-              <w:pStyle w:val="ListBullet"/>
-              <w:rPr>
-                <w:lang w:val="pt-BR"/>
-              </w:rPr>
-            </w:pPr>
-            <w:r>
-              <w:rPr>
-                <w:lang w:val="pt-BR"/>
-              </w:rPr>
-              <w:t>Familiaridade com o pacote Office.</w:t>
-            </w:r>
-          </w:p>
-          <w:p>
-            <w:pPr>
-              <w:pStyle w:val="ListBullet"/>
-              <w:rPr>
-                <w:lang w:val="pt-BR"/>
-              </w:rPr>
-            </w:pPr>
-            <w:r>
-              <w:rPr>
-                <w:lang w:val="pt-BR"/>
-              </w:rPr>
-              <w:t>Bom entendimento e hábito do uso da ferramenta de versionamento GIT.</w:t>
-            </w:r>
+              <w:numPr>
+                <w:ilvl w:val="0"/>
+                <w:numId w:val="0"/>
+              </w:numPr>
+              <w:ind w:left="360"/>
+              <w:rPr>
+                <w:lang w:val="pt-BR"/>
+              </w:rPr>
+            </w:pPr>
           </w:p>
         </w:tc>
       </w:tr>
@@ -1392,7 +1494,7 @@
 </file>
 
 <file path=word/endnotes.xml><?xml version="1.0" encoding="utf-8"?>
-<w:endnotes xmlns:wpc="http://schemas.microsoft.com/office/word/2010/wordprocessingCanvas" xmlns:cx="http://schemas.microsoft.com/office/drawing/2014/chartex" xmlns:cx1="http://schemas.microsoft.com/office/drawing/2015/9/8/chartex" xmlns:cx2="http://schemas.microsoft.com/office/drawing/2015/10/21/chartex" xmlns:cx3="http://schemas.microsoft.com/office/drawing/2016/5/9/chartex" xmlns:cx4="http://schemas.microsoft.com/office/drawing/2016/5/10/chartex" xmlns:cx5="http://schemas.microsoft.com/office/drawing/2016/5/11/chartex" xmlns:cx6="http://schemas.microsoft.com/office/drawing/2016/5/12/chartex" xmlns:cx7="http://schemas.microsoft.com/office/drawing/2016/5/13/chartex" xmlns:cx8="http://schemas.microsoft.com/office/drawing/2016/5/14/chartex" xmlns:mc="http://schemas.openxmlformats.org/markup-compatibility/2006" xmlns:aink="http://schemas.microsoft.com/office/drawing/2016/ink" xmlns:am3d="http://schemas.microsoft.com/office/drawing/2017/model3d" xmlns:o="urn:schemas-microsoft-com:office:office" xmlns:r="http://schemas.openxmlformats.org/officeDocument/2006/relationships" xmlns:m="http://schemas.openxmlformats.org/officeDocument/2006/math" xmlns:v="urn:schemas-microsoft-com:vml" xmlns:wp14="http://schemas.microsoft.com/office/word/2010/wordprocessingDrawing" xmlns:wp="http://schemas.openxmlformats.org/drawingml/2006/wordprocessingDrawing" xmlns:w10="urn:schemas-microsoft-com:office:word" xmlns:w="http://schemas.openxmlformats.org/wordprocessingml/2006/main" xmlns:w14="http://schemas.microsoft.com/office/word/2010/wordml" xmlns:w15="http://schemas.microsoft.com/office/word/2012/wordml" xmlns:w16cex="http://schemas.microsoft.com/office/word/2018/wordml/cex" xmlns:w16cid="http://schemas.microsoft.com/office/word/2016/wordml/cid" xmlns:w16="http://schemas.microsoft.com/office/word/2018/wordml" xmlns:w16sdtdh="http://schemas.microsoft.com/office/word/2020/wordml/sdtdatahash" xmlns:w16se="http://schemas.microsoft.com/office/word/2015/wordml/symex" xmlns:wpg="http://schemas.microsoft.com/office/word/2010/wordprocessingGroup" xmlns:wpi="http://schemas.microsoft.com/office/word/2010/wordprocessingInk" xmlns:wne="http://schemas.microsoft.com/office/word/2006/wordml" xmlns:wps="http://schemas.microsoft.com/office/word/2010/wordprocessingShape" mc:Ignorable="w14 w15 w16se w16cid w16 w16cex w16sdtdh wp14">
+<w:endnotes xmlns:wpc="http://schemas.microsoft.com/office/word/2010/wordprocessingCanvas" xmlns:cx="http://schemas.microsoft.com/office/drawing/2014/chartex" xmlns:cx1="http://schemas.microsoft.com/office/drawing/2015/9/8/chartex" xmlns:cx2="http://schemas.microsoft.com/office/drawing/2015/10/21/chartex" xmlns:cx3="http://schemas.microsoft.com/office/drawing/2016/5/9/chartex" xmlns:cx4="http://schemas.microsoft.com/office/drawing/2016/5/10/chartex" xmlns:cx5="http://schemas.microsoft.com/office/drawing/2016/5/11/chartex" xmlns:cx6="http://schemas.microsoft.com/office/drawing/2016/5/12/chartex" xmlns:cx7="http://schemas.microsoft.com/office/drawing/2016/5/13/chartex" xmlns:cx8="http://schemas.microsoft.com/office/drawing/2016/5/14/chartex" xmlns:mc="http://schemas.openxmlformats.org/markup-compatibility/2006" xmlns:aink="http://schemas.microsoft.com/office/drawing/2016/ink" xmlns:am3d="http://schemas.microsoft.com/office/drawing/2017/model3d" xmlns:o="urn:schemas-microsoft-com:office:office" xmlns:oel="http://schemas.microsoft.com/office/2019/extlst" xmlns:r="http://schemas.openxmlformats.org/officeDocument/2006/relationships" xmlns:m="http://schemas.openxmlformats.org/officeDocument/2006/math" xmlns:v="urn:schemas-microsoft-com:vml" xmlns:wp14="http://schemas.microsoft.com/office/word/2010/wordprocessingDrawing" xmlns:wp="http://schemas.openxmlformats.org/drawingml/2006/wordprocessingDrawing" xmlns:w10="urn:schemas-microsoft-com:office:word" xmlns:w="http://schemas.openxmlformats.org/wordprocessingml/2006/main" xmlns:w14="http://schemas.microsoft.com/office/word/2010/wordml" xmlns:w15="http://schemas.microsoft.com/office/word/2012/wordml" xmlns:w16cex="http://schemas.microsoft.com/office/word/2018/wordml/cex" xmlns:w16cid="http://schemas.microsoft.com/office/word/2016/wordml/cid" xmlns:w16="http://schemas.microsoft.com/office/word/2018/wordml" xmlns:w16du="http://schemas.microsoft.com/office/word/2023/wordml/word16du" xmlns:w16sdtdh="http://schemas.microsoft.com/office/word/2020/wordml/sdtdatahash" xmlns:w16sdtfl="http://schemas.microsoft.com/office/word/2024/wordml/sdtformatlock" xmlns:w16se="http://schemas.microsoft.com/office/word/2015/wordml/symex" xmlns:wpg="http://schemas.microsoft.com/office/word/2010/wordprocessingGroup" xmlns:wpi="http://schemas.microsoft.com/office/word/2010/wordprocessingInk" xmlns:wne="http://schemas.microsoft.com/office/word/2006/wordml" xmlns:wps="http://schemas.microsoft.com/office/word/2010/wordprocessingShape" mc:Ignorable="w14 w15 w16se w16cid w16 w16cex w16sdtdh w16sdtfl w16du wp14">
   <w:endnote w:type="separator" w:id="-1">
     <w:p>
       <w:pPr>
@@ -1417,7 +1519,7 @@
 </file>
 
 <file path=word/footnotes.xml><?xml version="1.0" encoding="utf-8"?>
-<w:footnotes xmlns:wpc="http://schemas.microsoft.com/office/word/2010/wordprocessingCanvas" xmlns:cx="http://schemas.microsoft.com/office/drawing/2014/chartex" xmlns:cx1="http://schemas.microsoft.com/office/drawing/2015/9/8/chartex" xmlns:cx2="http://schemas.microsoft.com/office/drawing/2015/10/21/chartex" xmlns:cx3="http://schemas.microsoft.com/office/drawing/2016/5/9/chartex" xmlns:cx4="http://schemas.microsoft.com/office/drawing/2016/5/10/chartex" xmlns:cx5="http://schemas.microsoft.com/office/drawing/2016/5/11/chartex" xmlns:cx6="http://schemas.microsoft.com/office/drawing/2016/5/12/chartex" xmlns:cx7="http://schemas.microsoft.com/office/drawing/2016/5/13/chartex" xmlns:cx8="http://schemas.microsoft.com/office/drawing/2016/5/14/chartex" xmlns:mc="http://schemas.openxmlformats.org/markup-compatibility/2006" xmlns:aink="http://schemas.microsoft.com/office/drawing/2016/ink" xmlns:am3d="http://schemas.microsoft.com/office/drawing/2017/model3d" xmlns:o="urn:schemas-microsoft-com:office:office" xmlns:r="http://schemas.openxmlformats.org/officeDocument/2006/relationships" xmlns:m="http://schemas.openxmlformats.org/officeDocument/2006/math" xmlns:v="urn:schemas-microsoft-com:vml" xmlns:wp14="http://schemas.microsoft.com/office/word/2010/wordprocessingDrawing" xmlns:wp="http://schemas.openxmlformats.org/drawingml/2006/wordprocessingDrawing" xmlns:w10="urn:schemas-microsoft-com:office:word" xmlns:w="http://schemas.openxmlformats.org/wordprocessingml/2006/main" xmlns:w14="http://schemas.microsoft.com/office/word/2010/wordml" xmlns:w15="http://schemas.microsoft.com/office/word/2012/wordml" xmlns:w16cex="http://schemas.microsoft.com/office/word/2018/wordml/cex" xmlns:w16cid="http://schemas.microsoft.com/office/word/2016/wordml/cid" xmlns:w16="http://schemas.microsoft.com/office/word/2018/wordml" xmlns:w16sdtdh="http://schemas.microsoft.com/office/word/2020/wordml/sdtdatahash" xmlns:w16se="http://schemas.microsoft.com/office/word/2015/wordml/symex" xmlns:wpg="http://schemas.microsoft.com/office/word/2010/wordprocessingGroup" xmlns:wpi="http://schemas.microsoft.com/office/word/2010/wordprocessingInk" xmlns:wne="http://schemas.microsoft.com/office/word/2006/wordml" xmlns:wps="http://schemas.microsoft.com/office/word/2010/wordprocessingShape" mc:Ignorable="w14 w15 w16se w16cid w16 w16cex w16sdtdh wp14">
+<w:footnotes xmlns:wpc="http://schemas.microsoft.com/office/word/2010/wordprocessingCanvas" xmlns:cx="http://schemas.microsoft.com/office/drawing/2014/chartex" xmlns:cx1="http://schemas.microsoft.com/office/drawing/2015/9/8/chartex" xmlns:cx2="http://schemas.microsoft.com/office/drawing/2015/10/21/chartex" xmlns:cx3="http://schemas.microsoft.com/office/drawing/2016/5/9/chartex" xmlns:cx4="http://schemas.microsoft.com/office/drawing/2016/5/10/chartex" xmlns:cx5="http://schemas.microsoft.com/office/drawing/2016/5/11/chartex" xmlns:cx6="http://schemas.microsoft.com/office/drawing/2016/5/12/chartex" xmlns:cx7="http://schemas.microsoft.com/office/drawing/2016/5/13/chartex" xmlns:cx8="http://schemas.microsoft.com/office/drawing/2016/5/14/chartex" xmlns:mc="http://schemas.openxmlformats.org/markup-compatibility/2006" xmlns:aink="http://schemas.microsoft.com/office/drawing/2016/ink" xmlns:am3d="http://schemas.microsoft.com/office/drawing/2017/model3d" xmlns:o="urn:schemas-microsoft-com:office:office" xmlns:oel="http://schemas.microsoft.com/office/2019/extlst" xmlns:r="http://schemas.openxmlformats.org/officeDocument/2006/relationships" xmlns:m="http://schemas.openxmlformats.org/officeDocument/2006/math" xmlns:v="urn:schemas-microsoft-com:vml" xmlns:wp14="http://schemas.microsoft.com/office/word/2010/wordprocessingDrawing" xmlns:wp="http://schemas.openxmlformats.org/drawingml/2006/wordprocessingDrawing" xmlns:w10="urn:schemas-microsoft-com:office:word" xmlns:w="http://schemas.openxmlformats.org/wordprocessingml/2006/main" xmlns:w14="http://schemas.microsoft.com/office/word/2010/wordml" xmlns:w15="http://schemas.microsoft.com/office/word/2012/wordml" xmlns:w16cex="http://schemas.microsoft.com/office/word/2018/wordml/cex" xmlns:w16cid="http://schemas.microsoft.com/office/word/2016/wordml/cid" xmlns:w16="http://schemas.microsoft.com/office/word/2018/wordml" xmlns:w16du="http://schemas.microsoft.com/office/word/2023/wordml/word16du" xmlns:w16sdtdh="http://schemas.microsoft.com/office/word/2020/wordml/sdtdatahash" xmlns:w16sdtfl="http://schemas.microsoft.com/office/word/2024/wordml/sdtformatlock" xmlns:w16se="http://schemas.microsoft.com/office/word/2015/wordml/symex" xmlns:wpg="http://schemas.microsoft.com/office/word/2010/wordprocessingGroup" xmlns:wpi="http://schemas.microsoft.com/office/word/2010/wordprocessingInk" xmlns:wne="http://schemas.microsoft.com/office/word/2006/wordml" xmlns:wps="http://schemas.microsoft.com/office/word/2010/wordprocessingShape" mc:Ignorable="w14 w15 w16se w16cid w16 w16cex w16sdtdh w16sdtfl w16du wp14">
   <w:footnote w:type="separator" w:id="-1">
     <w:p>
       <w:pPr>
@@ -1442,11 +1544,11 @@
 </file>
 
 <file path=word/numbering.xml><?xml version="1.0" encoding="utf-8"?>
-<w:numbering xmlns:wpc="http://schemas.microsoft.com/office/word/2010/wordprocessingCanvas" xmlns:cx="http://schemas.microsoft.com/office/drawing/2014/chartex" xmlns:cx1="http://schemas.microsoft.com/office/drawing/2015/9/8/chartex" xmlns:cx2="http://schemas.microsoft.com/office/drawing/2015/10/21/chartex" xmlns:cx3="http://schemas.microsoft.com/office/drawing/2016/5/9/chartex" xmlns:cx4="http://schemas.microsoft.com/office/drawing/2016/5/10/chartex" xmlns:cx5="http://schemas.microsoft.com/office/drawing/2016/5/11/chartex" xmlns:cx6="http://schemas.microsoft.com/office/drawing/2016/5/12/chartex" xmlns:cx7="http://schemas.microsoft.com/office/drawing/2016/5/13/chartex" xmlns:cx8="http://schemas.microsoft.com/office/drawing/2016/5/14/chartex" xmlns:mc="http://schemas.openxmlformats.org/markup-compatibility/2006" xmlns:aink="http://schemas.microsoft.com/office/drawing/2016/ink" xmlns:am3d="http://schemas.microsoft.com/office/drawing/2017/model3d" xmlns:o="urn:schemas-microsoft-com:office:office" xmlns:r="http://schemas.openxmlformats.org/officeDocument/2006/relationships" xmlns:m="http://schemas.openxmlformats.org/officeDocument/2006/math" xmlns:v="urn:schemas-microsoft-com:vml" xmlns:wp14="http://schemas.microsoft.com/office/word/2010/wordprocessingDrawing" xmlns:wp="http://schemas.openxmlformats.org/drawingml/2006/wordprocessingDrawing" xmlns:w10="urn:schemas-microsoft-com:office:word" xmlns:w="http://schemas.openxmlformats.org/wordprocessingml/2006/main" xmlns:w14="http://schemas.microsoft.com/office/word/2010/wordml" xmlns:w15="http://schemas.microsoft.com/office/word/2012/wordml" xmlns:w16cex="http://schemas.microsoft.com/office/word/2018/wordml/cex" xmlns:w16cid="http://schemas.microsoft.com/office/word/2016/wordml/cid" xmlns:w16="http://schemas.microsoft.com/office/word/2018/wordml" xmlns:w16sdtdh="http://schemas.microsoft.com/office/word/2020/wordml/sdtdatahash" xmlns:w16se="http://schemas.microsoft.com/office/word/2015/wordml/symex" xmlns:wpg="http://schemas.microsoft.com/office/word/2010/wordprocessingGroup" xmlns:wpi="http://schemas.microsoft.com/office/word/2010/wordprocessingInk" xmlns:wne="http://schemas.microsoft.com/office/word/2006/wordml" xmlns:wps="http://schemas.microsoft.com/office/word/2010/wordprocessingShape" mc:Ignorable="w14 w15 w16se w16cid w16 w16cex w16sdtdh wp14">
+<w:numbering xmlns:wpc="http://schemas.microsoft.com/office/word/2010/wordprocessingCanvas" xmlns:cx="http://schemas.microsoft.com/office/drawing/2014/chartex" xmlns:cx1="http://schemas.microsoft.com/office/drawing/2015/9/8/chartex" xmlns:cx2="http://schemas.microsoft.com/office/drawing/2015/10/21/chartex" xmlns:cx3="http://schemas.microsoft.com/office/drawing/2016/5/9/chartex" xmlns:cx4="http://schemas.microsoft.com/office/drawing/2016/5/10/chartex" xmlns:cx5="http://schemas.microsoft.com/office/drawing/2016/5/11/chartex" xmlns:cx6="http://schemas.microsoft.com/office/drawing/2016/5/12/chartex" xmlns:cx7="http://schemas.microsoft.com/office/drawing/2016/5/13/chartex" xmlns:cx8="http://schemas.microsoft.com/office/drawing/2016/5/14/chartex" xmlns:mc="http://schemas.openxmlformats.org/markup-compatibility/2006" xmlns:aink="http://schemas.microsoft.com/office/drawing/2016/ink" xmlns:am3d="http://schemas.microsoft.com/office/drawing/2017/model3d" xmlns:o="urn:schemas-microsoft-com:office:office" xmlns:oel="http://schemas.microsoft.com/office/2019/extlst" xmlns:r="http://schemas.openxmlformats.org/officeDocument/2006/relationships" xmlns:m="http://schemas.openxmlformats.org/officeDocument/2006/math" xmlns:v="urn:schemas-microsoft-com:vml" xmlns:wp14="http://schemas.microsoft.com/office/word/2010/wordprocessingDrawing" xmlns:wp="http://schemas.openxmlformats.org/drawingml/2006/wordprocessingDrawing" xmlns:w10="urn:schemas-microsoft-com:office:word" xmlns:w="http://schemas.openxmlformats.org/wordprocessingml/2006/main" xmlns:w14="http://schemas.microsoft.com/office/word/2010/wordml" xmlns:w15="http://schemas.microsoft.com/office/word/2012/wordml" xmlns:w16cex="http://schemas.microsoft.com/office/word/2018/wordml/cex" xmlns:w16cid="http://schemas.microsoft.com/office/word/2016/wordml/cid" xmlns:w16="http://schemas.microsoft.com/office/word/2018/wordml" xmlns:w16du="http://schemas.microsoft.com/office/word/2023/wordml/word16du" xmlns:w16sdtdh="http://schemas.microsoft.com/office/word/2020/wordml/sdtdatahash" xmlns:w16sdtfl="http://schemas.microsoft.com/office/word/2024/wordml/sdtformatlock" xmlns:w16se="http://schemas.microsoft.com/office/word/2015/wordml/symex" xmlns:wpg="http://schemas.microsoft.com/office/word/2010/wordprocessingGroup" xmlns:wpi="http://schemas.microsoft.com/office/word/2010/wordprocessingInk" xmlns:wne="http://schemas.microsoft.com/office/word/2006/wordml" xmlns:wps="http://schemas.microsoft.com/office/word/2010/wordprocessingShape" mc:Ignorable="w14 w15 w16se w16cid w16 w16cex w16sdtdh w16sdtfl w16du wp14">
   <w:abstractNum w:abstractNumId="0" w15:restartNumberingAfterBreak="0">
     <w:nsid w:val="FFFFFF89"/>
     <w:multiLevelType w:val="singleLevel"/>
-    <w:tmpl w:val="F29CCF44"/>
+    <w:tmpl w:val="8B047E1C"/>
     <w:lvl w:ilvl="0">
       <w:start w:val="1"/>
       <w:numFmt w:val="bullet"/>
@@ -1758,23 +1860,23 @@
       </w:pPr>
     </w:lvl>
   </w:abstractNum>
-  <w:num w:numId="1">
+  <w:num w:numId="1" w16cid:durableId="108008614">
     <w:abstractNumId w:val="1"/>
   </w:num>
-  <w:num w:numId="2">
+  <w:num w:numId="2" w16cid:durableId="1251429350">
     <w:abstractNumId w:val="3"/>
   </w:num>
-  <w:num w:numId="3">
+  <w:num w:numId="3" w16cid:durableId="949362178">
     <w:abstractNumId w:val="2"/>
   </w:num>
-  <w:num w:numId="4">
+  <w:num w:numId="4" w16cid:durableId="1768378524">
     <w:abstractNumId w:val="0"/>
   </w:num>
 </w:numbering>
 </file>
 
 <file path=word/styles.xml><?xml version="1.0" encoding="utf-8"?>
-<w:styles xmlns:mc="http://schemas.openxmlformats.org/markup-compatibility/2006" xmlns:r="http://schemas.openxmlformats.org/officeDocument/2006/relationships" xmlns:w="http://schemas.openxmlformats.org/wordprocessingml/2006/main" xmlns:w14="http://schemas.microsoft.com/office/word/2010/wordml" xmlns:w15="http://schemas.microsoft.com/office/word/2012/wordml" xmlns:w16cex="http://schemas.microsoft.com/office/word/2018/wordml/cex" xmlns:w16cid="http://schemas.microsoft.com/office/word/2016/wordml/cid" xmlns:w16="http://schemas.microsoft.com/office/word/2018/wordml" xmlns:w16sdtdh="http://schemas.microsoft.com/office/word/2020/wordml/sdtdatahash" xmlns:w16se="http://schemas.microsoft.com/office/word/2015/wordml/symex" mc:Ignorable="w14 w15 w16se w16cid w16 w16cex w16sdtdh">
+<w:styles xmlns:mc="http://schemas.openxmlformats.org/markup-compatibility/2006" xmlns:r="http://schemas.openxmlformats.org/officeDocument/2006/relationships" xmlns:w="http://schemas.openxmlformats.org/wordprocessingml/2006/main" xmlns:w14="http://schemas.microsoft.com/office/word/2010/wordml" xmlns:w15="http://schemas.microsoft.com/office/word/2012/wordml" xmlns:w16cex="http://schemas.microsoft.com/office/word/2018/wordml/cex" xmlns:w16cid="http://schemas.microsoft.com/office/word/2016/wordml/cid" xmlns:w16="http://schemas.microsoft.com/office/word/2018/wordml" xmlns:w16du="http://schemas.microsoft.com/office/word/2023/wordml/word16du" xmlns:w16sdtdh="http://schemas.microsoft.com/office/word/2020/wordml/sdtdatahash" xmlns:w16sdtfl="http://schemas.microsoft.com/office/word/2024/wordml/sdtformatlock" xmlns:w16se="http://schemas.microsoft.com/office/word/2015/wordml/symex" mc:Ignorable="w14 w15 w16se w16cid w16 w16cex w16sdtdh w16sdtfl w16du">
   <w:docDefaults>
     <w:rPrDefault>
       <w:rPr>
@@ -2255,7 +2357,6 @@
   <w:style w:type="character" w:default="1" w:styleId="DefaultParagraphFont">
     <w:name w:val="Default Paragraph Font"/>
     <w:uiPriority w:val="1"/>
-    <w:semiHidden/>
     <w:unhideWhenUsed/>
   </w:style>
   <w:style w:type="table" w:default="1" w:styleId="TableNormal">
@@ -2839,35 +2940,6 @@
 </file>
 
 <file path=customXml/item1.xml><?xml version="1.0" encoding="utf-8"?>
-<p:properties xmlns:p="http://schemas.microsoft.com/office/2006/metadata/properties" xmlns:xsi="http://www.w3.org/2001/XMLSchema-instance" xmlns:pc="http://schemas.microsoft.com/office/infopath/2007/PartnerControls">
-  <documentManagement>
-    <_ip_UnifiedCompliancePolicyUIAction xmlns="http://schemas.microsoft.com/sharepoint/v3" xsi:nil="true"/>
-    <Image xmlns="71af3243-3dd4-4a8d-8c0d-dd76da1f02a5">
-      <Url xsi:nil="true"/>
-      <Description xsi:nil="true"/>
-    </Image>
-    <Status xmlns="71af3243-3dd4-4a8d-8c0d-dd76da1f02a5">Not started</Status>
-    <Background xmlns="71af3243-3dd4-4a8d-8c0d-dd76da1f02a5">false</Background>
-    <_ip_UnifiedCompliancePolicyProperties xmlns="http://schemas.microsoft.com/sharepoint/v3" xsi:nil="true"/>
-    <ImageTagsTaxHTField xmlns="71af3243-3dd4-4a8d-8c0d-dd76da1f02a5">
-      <Terms xmlns="http://schemas.microsoft.com/office/infopath/2007/PartnerControls"/>
-    </ImageTagsTaxHTField>
-    <TaxCatchAll xmlns="230e9df3-be65-4c73-a93b-d1236ebd677e" xsi:nil="true"/>
-    <MediaServiceKeyPoints xmlns="71af3243-3dd4-4a8d-8c0d-dd76da1f02a5" xsi:nil="true"/>
-  </documentManagement>
-</p:properties>
-</file>
-
-<file path=customXml/item2.xml><?xml version="1.0" encoding="utf-8"?>
-<?mso-contentType ?>
-<FormTemplates xmlns="http://schemas.microsoft.com/sharepoint/v3/contenttype/forms">
-  <Display>DocumentLibraryForm</Display>
-  <Edit>DocumentLibraryForm</Edit>
-  <New>DocumentLibraryForm</New>
-</FormTemplates>
-</file>
-
-<file path=customXml/item3.xml><?xml version="1.0" encoding="utf-8"?>
 <ct:contentTypeSchema xmlns:ct="http://schemas.microsoft.com/office/2006/metadata/contentType" xmlns:ma="http://schemas.microsoft.com/office/2006/metadata/properties/metaAttributes" ct:_="" ma:_="" ma:contentTypeName="Document" ma:contentTypeID="0x01010079F111ED35F8CC479449609E8A0923A6" ma:contentTypeVersion="29" ma:contentTypeDescription="Create a new document." ma:contentTypeScope="" ma:versionID="6a914531ae0f23be31da2eba1f3b42a9">
   <xsd:schema xmlns:xsd="http://www.w3.org/2001/XMLSchema" xmlns:xs="http://www.w3.org/2001/XMLSchema" xmlns:p="http://schemas.microsoft.com/office/2006/metadata/properties" xmlns:ns1="http://schemas.microsoft.com/sharepoint/v3" xmlns:ns2="71af3243-3dd4-4a8d-8c0d-dd76da1f02a5" xmlns:ns3="16c05727-aa75-4e4a-9b5f-8a80a1165891" xmlns:ns4="230e9df3-be65-4c73-a93b-d1236ebd677e" targetNamespace="http://schemas.microsoft.com/office/2006/metadata/properties" ma:root="true" ma:fieldsID="ae00154c9e66547f022c4923f88826d6" ns1:_="" ns2:_="" ns3:_="" ns4:_="">
     <xsd:import namespace="http://schemas.microsoft.com/sharepoint/v3"/>
@@ -3179,27 +3251,36 @@
 </ct:contentTypeSchema>
 </file>
 
-<file path=customXml/itemProps1.xml><?xml version="1.0" encoding="utf-8"?>
-<ds:datastoreItem xmlns:ds="http://schemas.openxmlformats.org/officeDocument/2006/customXml" ds:itemID="{CE6918B0-4900-4A50-93ED-CE0C9D50CFD6}">
-  <ds:schemaRefs>
-    <ds:schemaRef ds:uri="http://schemas.microsoft.com/office/2006/metadata/properties"/>
-    <ds:schemaRef ds:uri="http://schemas.microsoft.com/office/infopath/2007/PartnerControls"/>
-    <ds:schemaRef ds:uri="http://schemas.microsoft.com/sharepoint/v3"/>
-    <ds:schemaRef ds:uri="71af3243-3dd4-4a8d-8c0d-dd76da1f02a5"/>
-    <ds:schemaRef ds:uri="230e9df3-be65-4c73-a93b-d1236ebd677e"/>
-  </ds:schemaRefs>
-</ds:datastoreItem>
+<file path=customXml/item2.xml><?xml version="1.0" encoding="utf-8"?>
+<?mso-contentType ?>
+<FormTemplates xmlns="http://schemas.microsoft.com/sharepoint/v3/contenttype/forms">
+  <Display>DocumentLibraryForm</Display>
+  <Edit>DocumentLibraryForm</Edit>
+  <New>DocumentLibraryForm</New>
+</FormTemplates>
 </file>
 
-<file path=customXml/itemProps2.xml><?xml version="1.0" encoding="utf-8"?>
-<ds:datastoreItem xmlns:ds="http://schemas.openxmlformats.org/officeDocument/2006/customXml" ds:itemID="{6AE9180F-347B-4BDE-8CBF-50126570E421}">
-  <ds:schemaRefs>
-    <ds:schemaRef ds:uri="http://schemas.microsoft.com/sharepoint/v3/contenttype/forms"/>
-  </ds:schemaRefs>
-</ds:datastoreItem>
+<file path=customXml/item3.xml><?xml version="1.0" encoding="utf-8"?>
+<p:properties xmlns:p="http://schemas.microsoft.com/office/2006/metadata/properties" xmlns:xsi="http://www.w3.org/2001/XMLSchema-instance" xmlns:pc="http://schemas.microsoft.com/office/infopath/2007/PartnerControls">
+  <documentManagement>
+    <_ip_UnifiedCompliancePolicyUIAction xmlns="http://schemas.microsoft.com/sharepoint/v3" xsi:nil="true"/>
+    <Image xmlns="71af3243-3dd4-4a8d-8c0d-dd76da1f02a5">
+      <Url xsi:nil="true"/>
+      <Description xsi:nil="true"/>
+    </Image>
+    <Status xmlns="71af3243-3dd4-4a8d-8c0d-dd76da1f02a5">Not started</Status>
+    <Background xmlns="71af3243-3dd4-4a8d-8c0d-dd76da1f02a5">false</Background>
+    <_ip_UnifiedCompliancePolicyProperties xmlns="http://schemas.microsoft.com/sharepoint/v3" xsi:nil="true"/>
+    <ImageTagsTaxHTField xmlns="71af3243-3dd4-4a8d-8c0d-dd76da1f02a5">
+      <Terms xmlns="http://schemas.microsoft.com/office/infopath/2007/PartnerControls"/>
+    </ImageTagsTaxHTField>
+    <TaxCatchAll xmlns="230e9df3-be65-4c73-a93b-d1236ebd677e" xsi:nil="true"/>
+    <MediaServiceKeyPoints xmlns="71af3243-3dd4-4a8d-8c0d-dd76da1f02a5" xsi:nil="true"/>
+  </documentManagement>
+</p:properties>
 </file>
 
-<file path=customXml/itemProps3.xml><?xml version="1.0" encoding="utf-8"?>
+<file path=customXml/itemProps1.xml><?xml version="1.0" encoding="utf-8"?>
 <ds:datastoreItem xmlns:ds="http://schemas.openxmlformats.org/officeDocument/2006/customXml" ds:itemID="{0F4C0447-40FA-4FFB-9968-E3A633FE9D3F}">
   <ds:schemaRefs>
     <ds:schemaRef ds:uri="http://schemas.microsoft.com/office/2006/metadata/contentType"/>
@@ -3220,6 +3301,26 @@
 </ds:datastoreItem>
 </file>
 
+<file path=customXml/itemProps2.xml><?xml version="1.0" encoding="utf-8"?>
+<ds:datastoreItem xmlns:ds="http://schemas.openxmlformats.org/officeDocument/2006/customXml" ds:itemID="{6AE9180F-347B-4BDE-8CBF-50126570E421}">
+  <ds:schemaRefs>
+    <ds:schemaRef ds:uri="http://schemas.microsoft.com/sharepoint/v3/contenttype/forms"/>
+  </ds:schemaRefs>
+</ds:datastoreItem>
+</file>
+
+<file path=customXml/itemProps3.xml><?xml version="1.0" encoding="utf-8"?>
+<ds:datastoreItem xmlns:ds="http://schemas.openxmlformats.org/officeDocument/2006/customXml" ds:itemID="{CE6918B0-4900-4A50-93ED-CE0C9D50CFD6}">
+  <ds:schemaRefs>
+    <ds:schemaRef ds:uri="http://schemas.microsoft.com/office/2006/metadata/properties"/>
+    <ds:schemaRef ds:uri="http://schemas.microsoft.com/office/infopath/2007/PartnerControls"/>
+    <ds:schemaRef ds:uri="http://schemas.microsoft.com/sharepoint/v3"/>
+    <ds:schemaRef ds:uri="71af3243-3dd4-4a8d-8c0d-dd76da1f02a5"/>
+    <ds:schemaRef ds:uri="230e9df3-be65-4c73-a93b-d1236ebd677e"/>
+  </ds:schemaRefs>
+</ds:datastoreItem>
+</file>
+
 <file path=docMetadata/LabelInfo.xml><?xml version="1.0" encoding="utf-8"?>
 <clbl:labelList xmlns:clbl="http://schemas.microsoft.com/office/2020/mipLabelMetadata"/>
 </file>
</xml_diff>

<commit_message>
Primeira versão boa de fato. Com pdf incluido.
</commit_message>
<xml_diff>
--- a/Maruhan Diego Zandonai.docx
+++ b/Maruhan Diego Zandonai.docx
@@ -97,21 +97,7 @@
               <w:rPr>
                 <w:lang w:val="pt-BR"/>
               </w:rPr>
-              <w:t xml:space="preserve">Engenheiro analítico, organizado e orientado a detalhes, com experiência em automação industrial e sistemas de controle, incluindo desenvolvimento de aplicações para </w:t>
-            </w:r>
-            <w:proofErr w:type="spellStart"/>
-            <w:r>
-              <w:rPr>
-                <w:lang w:val="pt-BR"/>
-              </w:rPr>
-              <w:t>CLPs</w:t>
-            </w:r>
-            <w:proofErr w:type="spellEnd"/>
-            <w:r>
-              <w:rPr>
-                <w:lang w:val="pt-BR"/>
-              </w:rPr>
-              <w:t xml:space="preserve"> e sistemas supervisórios. Profissional colaborativo, com facilidade para trabalho em equipe e forte senso de organização, focado em desenvolver soluções técnicas confiáveis e eficientes para resolução de problemas e melhoria contínua de processos.</w:t>
+              <w:t>Engenheiro analítico, organizado e orientado a detalhes, com experiência em automação industrial e sistemas de controle, incluindo desenvolvimento de aplicações para CLPs e sistemas supervisórios. Profissional colaborativo, com facilidade para trabalho em equipe e forte senso de organização, focado em desenvolver soluções técnicas confiáveis e eficientes para resolução de problemas e melhoria contínua de processos.</w:t>
             </w:r>
           </w:p>
         </w:tc>
@@ -219,35 +205,7 @@
               <w:rPr>
                 <w:lang w:val="pt-BR"/>
               </w:rPr>
-              <w:t xml:space="preserve">Desenvolvimento de sistemas de automação voltados ao setor de saneamento, incluindo programação de estações de tratamento de água e esgoto, </w:t>
-            </w:r>
-            <w:proofErr w:type="spellStart"/>
-            <w:r>
-              <w:rPr>
-                <w:lang w:val="pt-BR"/>
-              </w:rPr>
-              <w:t>boosters</w:t>
-            </w:r>
-            <w:proofErr w:type="spellEnd"/>
-            <w:r>
-              <w:rPr>
-                <w:lang w:val="pt-BR"/>
-              </w:rPr>
-              <w:t xml:space="preserve"> de pressão, além da criação de interfaces de usuário (</w:t>
-            </w:r>
-            <w:proofErr w:type="spellStart"/>
-            <w:r>
-              <w:rPr>
-                <w:lang w:val="pt-BR"/>
-              </w:rPr>
-              <w:t>IHMs</w:t>
-            </w:r>
-            <w:proofErr w:type="spellEnd"/>
-            <w:r>
-              <w:rPr>
-                <w:lang w:val="pt-BR"/>
-              </w:rPr>
-              <w:t xml:space="preserve">) e sistemas </w:t>
+              <w:t xml:space="preserve">Desenvolvimento de sistemas de automação voltados ao setor de saneamento, incluindo programação de estações de tratamento de água e esgoto, boosters de pressão, além da criação de interfaces de usuário (IHMs) e sistemas </w:t>
             </w:r>
             <w:r>
               <w:rPr>
@@ -617,13 +575,7 @@
               <w:rPr>
                 <w:lang w:val="pt-BR"/>
               </w:rPr>
-              <w:t>Universidade Federal de Santa Catarian</w:t>
-            </w:r>
-            <w:r>
-              <w:rPr>
-                <w:lang w:val="pt-BR"/>
-              </w:rPr>
-              <w:t>a</w:t>
+              <w:t>Universidade Federal de Santa Catariana</w:t>
             </w:r>
           </w:p>
           <w:p>
@@ -675,9 +627,15 @@
       </w:tr>
     </w:tbl>
     <w:p>
+      <w:pPr>
+        <w:rPr>
+          <w:lang w:val="pt-BR"/>
+        </w:rPr>
+      </w:pPr>
       <w:r>
         <w:rPr>
           <w:caps/>
+          <w:lang w:val="pt-BR"/>
         </w:rPr>
         <w:br w:type="page"/>
       </w:r>
@@ -815,19 +773,7 @@
               <w:rPr>
                 <w:lang w:val="pt-BR"/>
               </w:rPr>
-              <w:t>Inglês: Nível C</w:t>
-            </w:r>
-            <w:r>
-              <w:rPr>
-                <w:lang w:val="pt-BR"/>
-              </w:rPr>
-              <w:t xml:space="preserve">1: </w:t>
-            </w:r>
-            <w:r>
-              <w:rPr>
-                <w:lang w:val="pt-BR"/>
-              </w:rPr>
-              <w:t>Entende e fala muito bem</w:t>
+              <w:t>Inglês: Nível C1: Entende e fala muito bem</w:t>
             </w:r>
             <w:r>
               <w:rPr>
@@ -860,7 +806,7 @@
       </w:tr>
       <w:tr>
         <w:trPr>
-          <w:trHeight w:val="210"/>
+          <w:trHeight w:val="375"/>
         </w:trPr>
         <w:tc>
           <w:tcPr>
@@ -894,6 +840,29 @@
           <w:p>
             <w:pPr>
               <w:pStyle w:val="ListBullet"/>
+              <w:numPr>
+                <w:ilvl w:val="0"/>
+                <w:numId w:val="0"/>
+              </w:numPr>
+              <w:rPr>
+                <w:sz w:val="22"/>
+                <w:szCs w:val="24"/>
+                <w:lang w:val="pt-BR"/>
+              </w:rPr>
+            </w:pPr>
+            <w:r>
+              <w:rPr>
+                <w:rFonts w:asciiTheme="majorHAnsi" w:hAnsiTheme="majorHAnsi"/>
+                <w:caps/>
+                <w:color w:val="595959" w:themeColor="text1" w:themeTint="A6"/>
+                <w:lang w:val="pt-BR"/>
+              </w:rPr>
+              <w:t>Engenharia e Sistemas de Controle</w:t>
+            </w:r>
+          </w:p>
+          <w:p>
+            <w:pPr>
+              <w:pStyle w:val="ListBullet"/>
               <w:rPr>
                 <w:lang w:val="pt-BR"/>
               </w:rPr>
@@ -903,6 +872,20 @@
                 <w:lang w:val="pt-BR"/>
               </w:rPr>
               <w:t>Pensamento crítico aplicado a decisões de projeto.</w:t>
+            </w:r>
+          </w:p>
+          <w:p>
+            <w:pPr>
+              <w:pStyle w:val="ListBullet"/>
+              <w:rPr>
+                <w:lang w:val="pt-BR"/>
+              </w:rPr>
+            </w:pPr>
+            <w:r>
+              <w:rPr>
+                <w:lang w:val="pt-BR"/>
+              </w:rPr>
+              <w:t>Experiência no desenvolvimento de sistemas de controle voltados para a área de saneamento (controle de vazão, nível, pressão e concentração de produtos químicos), incluindo sistemas com atraso.</w:t>
             </w:r>
           </w:p>
         </w:tc>
@@ -916,15 +899,54 @@
           <w:p>
             <w:pPr>
               <w:pStyle w:val="ListBullet"/>
-              <w:rPr>
-                <w:lang w:val="pt-BR"/>
-              </w:rPr>
-            </w:pPr>
-            <w:r>
-              <w:rPr>
-                <w:lang w:val="pt-BR"/>
-              </w:rPr>
-              <w:t>Bom entendimento de sistemas elétricos industriais.</w:t>
+              <w:numPr>
+                <w:ilvl w:val="0"/>
+                <w:numId w:val="0"/>
+              </w:numPr>
+              <w:ind w:left="360"/>
+              <w:rPr>
+                <w:lang w:val="pt-BR"/>
+              </w:rPr>
+            </w:pPr>
+          </w:p>
+          <w:p>
+            <w:pPr>
+              <w:pStyle w:val="ListBullet"/>
+              <w:rPr>
+                <w:lang w:val="pt-BR"/>
+              </w:rPr>
+            </w:pPr>
+            <w:r>
+              <w:rPr>
+                <w:lang w:val="pt-BR"/>
+              </w:rPr>
+              <w:t>Bom entendimento de sistemas elétricos</w:t>
+            </w:r>
+            <w:r>
+              <w:rPr>
+                <w:lang w:val="pt-BR"/>
+              </w:rPr>
+              <w:t xml:space="preserve">, circuitos eletrônicos, circuitos pneumáticos e hidráulicos. </w:t>
+            </w:r>
+          </w:p>
+          <w:p>
+            <w:pPr>
+              <w:pStyle w:val="ListBullet"/>
+              <w:rPr>
+                <w:lang w:val="pt-BR"/>
+              </w:rPr>
+            </w:pPr>
+            <w:r>
+              <w:rPr>
+                <w:lang w:val="pt-BR"/>
+              </w:rPr>
+              <w:t>Experiência em aplicações de tempo real</w:t>
+            </w:r>
+            <w:r>
+              <w:rPr>
+                <w:lang w:val="pt-BR"/>
+              </w:rPr>
+              <w:t xml:space="preserve"> com o uso de microcontroladores.</w:t>
             </w:r>
           </w:p>
         </w:tc>
@@ -944,71 +966,51 @@
           <w:p>
             <w:pPr>
               <w:pStyle w:val="ListBullet"/>
-              <w:rPr>
-                <w:lang w:val="pt-BR"/>
-              </w:rPr>
-            </w:pPr>
-            <w:r>
-              <w:rPr>
-                <w:lang w:val="pt-BR"/>
-              </w:rPr>
-              <w:t>Experiência no desenvolvimento de sistemas de controle voltados para a área de saneamento (controle de vazão, nível, pressão e concentração de produtos químicos), incluindo sistemas com atraso.</w:t>
-            </w:r>
-          </w:p>
-          <w:p>
-            <w:pPr>
-              <w:pStyle w:val="ListBullet"/>
-              <w:rPr>
-                <w:lang w:val="pt-BR"/>
-              </w:rPr>
-            </w:pPr>
-            <w:r>
-              <w:rPr>
-                <w:lang w:val="pt-BR"/>
-              </w:rPr>
-              <w:t>Experiência no desenvolvimento de bibliotecas para controladores baseados em CODESYS.</w:t>
-            </w:r>
-          </w:p>
-          <w:p>
-            <w:pPr>
-              <w:pStyle w:val="ListBullet"/>
-              <w:rPr>
-                <w:lang w:val="pt-BR"/>
-              </w:rPr>
-            </w:pPr>
-            <w:r>
-              <w:rPr>
-                <w:lang w:val="pt-BR"/>
-              </w:rPr>
-              <w:t xml:space="preserve">Conhecimento em redes industriais, com entendimento do funcionamento e implementação de protocolos como </w:t>
-            </w:r>
-            <w:proofErr w:type="spellStart"/>
-            <w:r>
-              <w:rPr>
-                <w:lang w:val="pt-BR"/>
-              </w:rPr>
-              <w:t>Modbus</w:t>
-            </w:r>
-            <w:proofErr w:type="spellEnd"/>
-            <w:r>
-              <w:rPr>
-                <w:lang w:val="pt-BR"/>
-              </w:rPr>
-              <w:t xml:space="preserve">, MQTT e </w:t>
-            </w:r>
-            <w:proofErr w:type="spellStart"/>
-            <w:r>
-              <w:rPr>
-                <w:lang w:val="pt-BR"/>
-              </w:rPr>
-              <w:t>Profinet</w:t>
-            </w:r>
-            <w:proofErr w:type="spellEnd"/>
-            <w:r>
-              <w:rPr>
-                <w:lang w:val="pt-BR"/>
-              </w:rPr>
-              <w:t>.</w:t>
+              <w:numPr>
+                <w:ilvl w:val="0"/>
+                <w:numId w:val="0"/>
+              </w:numPr>
+              <w:ind w:left="360" w:hanging="360"/>
+              <w:rPr>
+                <w:lang w:val="pt-BR"/>
+              </w:rPr>
+            </w:pPr>
+            <w:r>
+              <w:rPr>
+                <w:rFonts w:asciiTheme="majorHAnsi" w:hAnsiTheme="majorHAnsi"/>
+                <w:caps/>
+                <w:color w:val="595959" w:themeColor="text1" w:themeTint="A6"/>
+                <w:lang w:val="pt-BR"/>
+              </w:rPr>
+              <w:t>Automação Industrial e Programação</w:t>
+            </w:r>
+          </w:p>
+          <w:p>
+            <w:pPr>
+              <w:pStyle w:val="ListBullet"/>
+              <w:rPr>
+                <w:lang w:val="pt-BR"/>
+              </w:rPr>
+            </w:pPr>
+            <w:r>
+              <w:rPr>
+                <w:lang w:val="pt-BR"/>
+              </w:rPr>
+              <w:t>Experiência no desenvolvimento de biblioteca para controladores baseados em CODESYS.</w:t>
+            </w:r>
+          </w:p>
+          <w:p>
+            <w:pPr>
+              <w:pStyle w:val="ListBullet"/>
+              <w:rPr>
+                <w:lang w:val="pt-BR"/>
+              </w:rPr>
+            </w:pPr>
+            <w:r>
+              <w:rPr>
+                <w:lang w:val="pt-BR"/>
+              </w:rPr>
+              <w:t>Conhecimento em redes industriais, com entendimento do funcionamento e implementação de protocolos como Modbus, MQTT e Profinet.</w:t>
             </w:r>
           </w:p>
         </w:tc>
@@ -1023,71 +1025,54 @@
           <w:p>
             <w:pPr>
               <w:pStyle w:val="ListBullet"/>
-              <w:rPr>
-                <w:lang w:val="pt-BR"/>
-              </w:rPr>
-            </w:pPr>
-            <w:r>
-              <w:rPr>
-                <w:lang w:val="pt-BR"/>
-              </w:rPr>
-              <w:t xml:space="preserve">Experiência em programação de controladores industriais de alta confiabilidade, utilizando linguagens conforme a necessidade da aplicação (ST, SCL, SFC, </w:t>
-            </w:r>
-            <w:proofErr w:type="spellStart"/>
-            <w:r>
-              <w:rPr>
-                <w:lang w:val="pt-BR"/>
-              </w:rPr>
-              <w:t>Bargraph</w:t>
-            </w:r>
-            <w:proofErr w:type="spellEnd"/>
-            <w:r>
-              <w:rPr>
-                <w:lang w:val="pt-BR"/>
-              </w:rPr>
-              <w:t xml:space="preserve"> e Ladder).</w:t>
-            </w:r>
-          </w:p>
-          <w:p>
-            <w:pPr>
-              <w:pStyle w:val="ListBullet"/>
-              <w:rPr>
-                <w:lang w:val="pt-BR"/>
-              </w:rPr>
-            </w:pPr>
-            <w:r>
-              <w:rPr>
-                <w:lang w:val="pt-BR"/>
-              </w:rPr>
-              <w:t xml:space="preserve">Projeto, desenvolvimento e integração de </w:t>
-            </w:r>
-            <w:proofErr w:type="spellStart"/>
-            <w:r>
-              <w:rPr>
-                <w:lang w:val="pt-BR"/>
-              </w:rPr>
-              <w:t>IHMs</w:t>
-            </w:r>
-            <w:proofErr w:type="spellEnd"/>
-            <w:r>
-              <w:rPr>
-                <w:lang w:val="pt-BR"/>
-              </w:rPr>
-              <w:t xml:space="preserve"> e sistemas supervisórios em ambientes multiplataforma (Schneider, ABB, Phoenix </w:t>
-            </w:r>
-            <w:proofErr w:type="spellStart"/>
-            <w:r>
-              <w:rPr>
-                <w:lang w:val="pt-BR"/>
-              </w:rPr>
-              <w:t>Contact</w:t>
-            </w:r>
-            <w:proofErr w:type="spellEnd"/>
-            <w:r>
-              <w:rPr>
-                <w:lang w:val="pt-BR"/>
-              </w:rPr>
-              <w:t>, Mitsubishi).</w:t>
+              <w:numPr>
+                <w:ilvl w:val="0"/>
+                <w:numId w:val="0"/>
+              </w:numPr>
+              <w:ind w:left="360"/>
+              <w:rPr>
+                <w:lang w:val="pt-BR"/>
+              </w:rPr>
+            </w:pPr>
+          </w:p>
+          <w:p>
+            <w:pPr>
+              <w:pStyle w:val="ListBullet"/>
+              <w:rPr>
+                <w:lang w:val="pt-BR"/>
+              </w:rPr>
+            </w:pPr>
+            <w:r>
+              <w:rPr>
+                <w:lang w:val="pt-BR"/>
+              </w:rPr>
+              <w:t>Experiência em programação de controladores industriais de alta confiabilidade, utilizando linguagens conforme a necessidade da aplicação (ST, SCL, SFC</w:t>
+            </w:r>
+            <w:r>
+              <w:rPr>
+                <w:lang w:val="pt-BR"/>
+              </w:rPr>
+              <w:t xml:space="preserve"> </w:t>
+            </w:r>
+            <w:r>
+              <w:rPr>
+                <w:lang w:val="pt-BR"/>
+              </w:rPr>
+              <w:t>e Ladder).</w:t>
+            </w:r>
+          </w:p>
+          <w:p>
+            <w:pPr>
+              <w:pStyle w:val="ListBullet"/>
+              <w:rPr>
+                <w:lang w:val="pt-BR"/>
+              </w:rPr>
+            </w:pPr>
+            <w:r>
+              <w:rPr>
+                <w:lang w:val="pt-BR"/>
+              </w:rPr>
+              <w:t>Projeto, desenvolvimento e integração de IHMs e sistemas supervisórios em ambientes multiplataforma (Schneider, ABB, Phoenix Contact, Mitsubishi).</w:t>
             </w:r>
           </w:p>
         </w:tc>
@@ -1107,170 +1092,65 @@
           <w:p>
             <w:pPr>
               <w:pStyle w:val="ListBullet"/>
-              <w:rPr>
-                <w:lang w:val="pt-BR"/>
-              </w:rPr>
-            </w:pPr>
-            <w:r>
-              <w:rPr>
-                <w:lang w:val="pt-BR"/>
-              </w:rPr>
-              <w:t xml:space="preserve">Experiência com linguagens de alto nível como Python (pandas, </w:t>
-            </w:r>
-            <w:proofErr w:type="spellStart"/>
-            <w:r>
-              <w:rPr>
-                <w:lang w:val="pt-BR"/>
-              </w:rPr>
-              <w:t>tkinter</w:t>
-            </w:r>
-            <w:proofErr w:type="spellEnd"/>
-            <w:r>
-              <w:rPr>
-                <w:lang w:val="pt-BR"/>
-              </w:rPr>
-              <w:t xml:space="preserve">, </w:t>
-            </w:r>
-            <w:proofErr w:type="spellStart"/>
-            <w:r>
-              <w:rPr>
-                <w:lang w:val="pt-BR"/>
-              </w:rPr>
-              <w:t>matplotlib</w:t>
-            </w:r>
-            <w:proofErr w:type="spellEnd"/>
-            <w:r>
-              <w:rPr>
-                <w:lang w:val="pt-BR"/>
-              </w:rPr>
-              <w:t xml:space="preserve">, </w:t>
-            </w:r>
-            <w:proofErr w:type="spellStart"/>
-            <w:r>
-              <w:rPr>
-                <w:lang w:val="pt-BR"/>
-              </w:rPr>
-              <w:t>control</w:t>
-            </w:r>
-            <w:proofErr w:type="spellEnd"/>
-            <w:r>
-              <w:rPr>
-                <w:lang w:val="pt-BR"/>
-              </w:rPr>
-              <w:t xml:space="preserve">, open-cv), Node-RED, MATLAB, Simulink e </w:t>
-            </w:r>
-            <w:proofErr w:type="spellStart"/>
-            <w:r>
-              <w:rPr>
-                <w:lang w:val="pt-BR"/>
-              </w:rPr>
-              <w:t>LabVIEW</w:t>
-            </w:r>
-            <w:proofErr w:type="spellEnd"/>
-            <w:r>
-              <w:rPr>
-                <w:lang w:val="pt-BR"/>
-              </w:rPr>
-              <w:t>.</w:t>
-            </w:r>
-          </w:p>
-          <w:p>
-            <w:pPr>
-              <w:pStyle w:val="ListBullet"/>
-              <w:rPr>
-                <w:lang w:val="pt-BR"/>
-              </w:rPr>
-            </w:pPr>
-            <w:r>
-              <w:rPr>
-                <w:lang w:val="pt-BR"/>
-              </w:rPr>
-              <w:t xml:space="preserve">Noções básicas de automações </w:t>
-            </w:r>
-            <w:proofErr w:type="spellStart"/>
-            <w:r>
-              <w:rPr>
-                <w:lang w:val="pt-BR"/>
-              </w:rPr>
-              <w:t>low-code</w:t>
-            </w:r>
-            <w:proofErr w:type="spellEnd"/>
-            <w:r>
-              <w:rPr>
-                <w:lang w:val="pt-BR"/>
-              </w:rPr>
-              <w:t xml:space="preserve"> (Power Apps, Power </w:t>
-            </w:r>
-            <w:proofErr w:type="spellStart"/>
-            <w:r>
-              <w:rPr>
-                <w:lang w:val="pt-BR"/>
-              </w:rPr>
-              <w:t>Automate</w:t>
-            </w:r>
-            <w:proofErr w:type="spellEnd"/>
-            <w:r>
-              <w:rPr>
-                <w:lang w:val="pt-BR"/>
-              </w:rPr>
-              <w:t xml:space="preserve">, </w:t>
-            </w:r>
-            <w:proofErr w:type="spellStart"/>
-            <w:r>
-              <w:rPr>
-                <w:lang w:val="pt-BR"/>
-              </w:rPr>
-              <w:t>Flows</w:t>
-            </w:r>
-            <w:proofErr w:type="spellEnd"/>
-            <w:r>
-              <w:rPr>
-                <w:lang w:val="pt-BR"/>
-              </w:rPr>
-              <w:t>).</w:t>
-            </w:r>
-          </w:p>
-          <w:p>
-            <w:pPr>
-              <w:pStyle w:val="ListBullet"/>
-              <w:rPr>
-                <w:lang w:val="pt-BR"/>
-              </w:rPr>
-            </w:pPr>
-            <w:r>
-              <w:rPr>
-                <w:lang w:val="pt-BR"/>
-              </w:rPr>
-              <w:t xml:space="preserve">Familiaridade com prototipagem de placas de circuito impresso (PCB) utilizando o software </w:t>
-            </w:r>
-            <w:proofErr w:type="spellStart"/>
-            <w:r>
-              <w:rPr>
-                <w:lang w:val="pt-BR"/>
-              </w:rPr>
-              <w:t>EasyEDA</w:t>
-            </w:r>
-            <w:proofErr w:type="spellEnd"/>
-            <w:r>
-              <w:rPr>
-                <w:lang w:val="pt-BR"/>
-              </w:rPr>
-              <w:t>.</w:t>
-            </w:r>
-          </w:p>
-          <w:p>
-            <w:pPr>
-              <w:pStyle w:val="ListBullet"/>
-              <w:rPr>
-                <w:lang w:val="pt-BR"/>
-              </w:rPr>
-            </w:pPr>
-            <w:r>
-              <w:rPr>
-                <w:lang w:val="pt-BR"/>
-              </w:rPr>
-              <w:t>Trabalho em equipe</w:t>
-            </w:r>
+              <w:numPr>
+                <w:ilvl w:val="0"/>
+                <w:numId w:val="0"/>
+              </w:numPr>
+              <w:ind w:left="360" w:hanging="360"/>
+              <w:rPr>
+                <w:lang w:val="pt-BR"/>
+              </w:rPr>
+            </w:pPr>
+            <w:r>
+              <w:rPr>
+                <w:rFonts w:asciiTheme="majorHAnsi" w:hAnsiTheme="majorHAnsi"/>
+                <w:caps/>
+                <w:color w:val="595959" w:themeColor="text1" w:themeTint="A6"/>
+                <w:lang w:val="pt-BR"/>
+              </w:rPr>
+              <w:t>Desenvolvimento e Ferramentas</w:t>
+            </w:r>
+          </w:p>
+          <w:p>
+            <w:pPr>
+              <w:pStyle w:val="ListBullet"/>
+              <w:rPr>
+                <w:lang w:val="pt-BR"/>
+              </w:rPr>
+            </w:pPr>
+            <w:r>
+              <w:rPr>
+                <w:lang w:val="pt-BR"/>
+              </w:rPr>
+              <w:t>Experiência com linguagens de alto nível como Python (pandas, tkinter, matplotlib, control, open-cv), Node-RED, MATLAB, Simulink e LabVIEW.</w:t>
+            </w:r>
+          </w:p>
+          <w:p>
+            <w:pPr>
+              <w:pStyle w:val="ListBullet"/>
+              <w:rPr>
+                <w:lang w:val="pt-BR"/>
+              </w:rPr>
+            </w:pPr>
+            <w:r>
+              <w:rPr>
+                <w:lang w:val="pt-BR"/>
+              </w:rPr>
+              <w:t>Noções básicas de automações low-code (Power Apps, Power Automate, Flows).</w:t>
+            </w:r>
+          </w:p>
+          <w:p>
+            <w:pPr>
+              <w:pStyle w:val="ListBullet"/>
+              <w:numPr>
+                <w:ilvl w:val="0"/>
+                <w:numId w:val="0"/>
+              </w:numPr>
+              <w:ind w:left="360"/>
+              <w:rPr>
+                <w:lang w:val="pt-BR"/>
+              </w:rPr>
+            </w:pPr>
           </w:p>
         </w:tc>
         <w:tc>
@@ -1284,72 +1164,15 @@
           <w:p>
             <w:pPr>
               <w:pStyle w:val="ListBullet"/>
-              <w:rPr>
-                <w:lang w:val="pt-BR"/>
-              </w:rPr>
-            </w:pPr>
-            <w:r>
-              <w:rPr>
-                <w:lang w:val="pt-BR"/>
-              </w:rPr>
-              <w:t xml:space="preserve">Conhecimento no uso de sistemas de aquisição de dados (DAQ), com experiência nas plataformas </w:t>
-            </w:r>
-            <w:proofErr w:type="spellStart"/>
-            <w:r>
-              <w:rPr>
-                <w:lang w:val="pt-BR"/>
-              </w:rPr>
-              <w:t>National</w:t>
-            </w:r>
-            <w:proofErr w:type="spellEnd"/>
-            <w:r>
-              <w:rPr>
-                <w:lang w:val="pt-BR"/>
-              </w:rPr>
-              <w:t xml:space="preserve"> </w:t>
-            </w:r>
-            <w:proofErr w:type="spellStart"/>
-            <w:r>
-              <w:rPr>
-                <w:lang w:val="pt-BR"/>
-              </w:rPr>
-              <w:t>Instruments</w:t>
-            </w:r>
-            <w:proofErr w:type="spellEnd"/>
-            <w:r>
-              <w:rPr>
-                <w:lang w:val="pt-BR"/>
-              </w:rPr>
-              <w:t xml:space="preserve"> e MCC-DAQ.</w:t>
-            </w:r>
-          </w:p>
-          <w:p>
-            <w:pPr>
-              <w:pStyle w:val="ListBullet"/>
-              <w:rPr>
-                <w:lang w:val="pt-BR"/>
-              </w:rPr>
-            </w:pPr>
-            <w:r>
-              <w:rPr>
-                <w:lang w:val="pt-BR"/>
-              </w:rPr>
-              <w:t>Experiência em projetos mecânicos, incluindo desenvolvimento de mecanismos e análise de esforços por elementos finitos.</w:t>
-            </w:r>
-          </w:p>
-          <w:p>
-            <w:pPr>
-              <w:pStyle w:val="ListBullet"/>
-              <w:rPr>
-                <w:lang w:val="pt-BR"/>
-              </w:rPr>
-            </w:pPr>
-            <w:r>
-              <w:rPr>
-                <w:lang w:val="pt-BR"/>
-              </w:rPr>
-              <w:t>Familiaridade com o pacote Office.</w:t>
-            </w:r>
+              <w:numPr>
+                <w:ilvl w:val="0"/>
+                <w:numId w:val="0"/>
+              </w:numPr>
+              <w:ind w:left="360"/>
+              <w:rPr>
+                <w:lang w:val="pt-BR"/>
+              </w:rPr>
+            </w:pPr>
           </w:p>
           <w:p>
             <w:pPr>
@@ -1363,6 +1186,411 @@
                 <w:lang w:val="pt-BR"/>
               </w:rPr>
               <w:t>Bom entendimento e hábito do uso da ferramenta de versionamento GIT.</w:t>
+            </w:r>
+          </w:p>
+          <w:p>
+            <w:pPr>
+              <w:pStyle w:val="ListBullet"/>
+              <w:rPr>
+                <w:lang w:val="pt-BR"/>
+              </w:rPr>
+            </w:pPr>
+            <w:r>
+              <w:rPr>
+                <w:lang w:val="pt-BR"/>
+              </w:rPr>
+              <w:t>Noções básicas de bancos de dados como MQTT, azure e MySQL.</w:t>
+            </w:r>
+          </w:p>
+        </w:tc>
+      </w:tr>
+      <w:tr>
+        <w:trPr>
+          <w:trHeight w:val="658"/>
+        </w:trPr>
+        <w:tc>
+          <w:tcPr>
+            <w:tcW w:w="5040" w:type="dxa"/>
+            <w:tcBorders>
+              <w:top w:val="single" w:sz="24" w:space="0" w:color="ACA8AA" w:themeColor="accent4"/>
+              <w:bottom w:val="single" w:sz="24" w:space="0" w:color="ACA8AA" w:themeColor="accent4"/>
+            </w:tcBorders>
+          </w:tcPr>
+          <w:p>
+            <w:pPr>
+              <w:pStyle w:val="ListBullet"/>
+              <w:numPr>
+                <w:ilvl w:val="0"/>
+                <w:numId w:val="0"/>
+              </w:numPr>
+              <w:ind w:left="360" w:hanging="360"/>
+              <w:rPr>
+                <w:rFonts w:asciiTheme="majorHAnsi" w:hAnsiTheme="majorHAnsi"/>
+                <w:caps/>
+                <w:color w:val="595959" w:themeColor="text1" w:themeTint="A6"/>
+                <w:lang w:val="pt-BR"/>
+              </w:rPr>
+            </w:pPr>
+            <w:r>
+              <w:rPr>
+                <w:rFonts w:asciiTheme="majorHAnsi" w:hAnsiTheme="majorHAnsi"/>
+                <w:caps/>
+                <w:color w:val="595959" w:themeColor="text1" w:themeTint="A6"/>
+                <w:lang w:val="pt-BR"/>
+              </w:rPr>
+              <w:t>Instrumentação e Aquisição de Dados</w:t>
+            </w:r>
+          </w:p>
+          <w:p>
+            <w:pPr>
+              <w:pStyle w:val="ListBullet"/>
+              <w:rPr>
+                <w:lang w:val="pt-BR"/>
+              </w:rPr>
+            </w:pPr>
+            <w:r>
+              <w:rPr>
+                <w:lang w:val="pt-BR"/>
+              </w:rPr>
+              <w:t>Conhecimento no uso de sistemas de aquisição de dados (DAQ), com experiência nas plataformas National Instruments e MCC-DAQ.</w:t>
+            </w:r>
+          </w:p>
+        </w:tc>
+        <w:tc>
+          <w:tcPr>
+            <w:tcW w:w="5040" w:type="dxa"/>
+            <w:tcBorders>
+              <w:top w:val="single" w:sz="24" w:space="0" w:color="ACA8AA" w:themeColor="accent4"/>
+              <w:bottom w:val="single" w:sz="24" w:space="0" w:color="ACA8AA" w:themeColor="accent4"/>
+            </w:tcBorders>
+          </w:tcPr>
+          <w:p>
+            <w:pPr>
+              <w:pStyle w:val="ListBullet"/>
+              <w:numPr>
+                <w:ilvl w:val="0"/>
+                <w:numId w:val="0"/>
+              </w:numPr>
+              <w:ind w:left="360"/>
+              <w:rPr>
+                <w:lang w:val="pt-BR"/>
+              </w:rPr>
+            </w:pPr>
+          </w:p>
+          <w:p>
+            <w:pPr>
+              <w:pStyle w:val="ListBullet"/>
+              <w:rPr>
+                <w:lang w:val="pt-BR"/>
+              </w:rPr>
+            </w:pPr>
+            <w:r>
+              <w:rPr>
+                <w:lang w:val="pt-BR"/>
+              </w:rPr>
+              <w:t>Conhecimento sobre filtros analógicos e digitais para tratamento de sinais.</w:t>
+            </w:r>
+          </w:p>
+        </w:tc>
+      </w:tr>
+      <w:tr>
+        <w:trPr>
+          <w:trHeight w:val="658"/>
+        </w:trPr>
+        <w:tc>
+          <w:tcPr>
+            <w:tcW w:w="5040" w:type="dxa"/>
+            <w:tcBorders>
+              <w:top w:val="single" w:sz="24" w:space="0" w:color="ACA8AA" w:themeColor="accent4"/>
+              <w:bottom w:val="single" w:sz="24" w:space="0" w:color="ACA8AA" w:themeColor="accent4"/>
+            </w:tcBorders>
+          </w:tcPr>
+          <w:p>
+            <w:pPr>
+              <w:pStyle w:val="ListBullet"/>
+              <w:numPr>
+                <w:ilvl w:val="0"/>
+                <w:numId w:val="0"/>
+              </w:numPr>
+              <w:ind w:left="360" w:hanging="360"/>
+              <w:rPr>
+                <w:rFonts w:asciiTheme="majorHAnsi" w:hAnsiTheme="majorHAnsi"/>
+                <w:caps/>
+                <w:color w:val="595959" w:themeColor="text1" w:themeTint="A6"/>
+                <w:lang w:val="pt-BR"/>
+              </w:rPr>
+            </w:pPr>
+            <w:r>
+              <w:rPr>
+                <w:rFonts w:asciiTheme="majorHAnsi" w:hAnsiTheme="majorHAnsi"/>
+                <w:caps/>
+                <w:color w:val="595959" w:themeColor="text1" w:themeTint="A6"/>
+                <w:lang w:val="pt-BR"/>
+              </w:rPr>
+              <w:lastRenderedPageBreak/>
+              <w:t>Projetos e Hardware</w:t>
+            </w:r>
+          </w:p>
+          <w:p>
+            <w:pPr>
+              <w:pStyle w:val="ListBullet"/>
+              <w:numPr>
+                <w:ilvl w:val="0"/>
+                <w:numId w:val="0"/>
+              </w:numPr>
+              <w:ind w:left="360" w:hanging="360"/>
+              <w:rPr>
+                <w:rFonts w:asciiTheme="majorHAnsi" w:hAnsiTheme="majorHAnsi"/>
+                <w:caps/>
+                <w:color w:val="595959" w:themeColor="text1" w:themeTint="A6"/>
+                <w:lang w:val="pt-BR"/>
+              </w:rPr>
+            </w:pPr>
+          </w:p>
+          <w:p>
+            <w:pPr>
+              <w:pStyle w:val="ListBullet"/>
+              <w:rPr>
+                <w:lang w:val="pt-BR"/>
+              </w:rPr>
+            </w:pPr>
+            <w:r>
+              <w:rPr>
+                <w:lang w:val="pt-BR"/>
+              </w:rPr>
+              <w:t>Familiaridade com prototipagem de placas de circuito impresso (PCB) utilizando o software EasyEDA.</w:t>
+            </w:r>
+          </w:p>
+          <w:p>
+            <w:pPr>
+              <w:pStyle w:val="ListBullet"/>
+              <w:rPr>
+                <w:lang w:val="pt-BR"/>
+              </w:rPr>
+            </w:pPr>
+            <w:r>
+              <w:rPr>
+                <w:lang w:val="pt-BR"/>
+              </w:rPr>
+              <w:t>Extensa experiência em softwares de programação de CLPs como o TIA Portal, Codesys 3.5, Machine Expert, Automation Builder, etc.</w:t>
+            </w:r>
+          </w:p>
+        </w:tc>
+        <w:tc>
+          <w:tcPr>
+            <w:tcW w:w="5040" w:type="dxa"/>
+            <w:tcBorders>
+              <w:top w:val="single" w:sz="24" w:space="0" w:color="ACA8AA" w:themeColor="accent4"/>
+              <w:bottom w:val="single" w:sz="24" w:space="0" w:color="ACA8AA" w:themeColor="accent4"/>
+            </w:tcBorders>
+          </w:tcPr>
+          <w:p>
+            <w:pPr>
+              <w:pStyle w:val="ListBullet"/>
+              <w:numPr>
+                <w:ilvl w:val="0"/>
+                <w:numId w:val="0"/>
+              </w:numPr>
+              <w:ind w:left="360"/>
+              <w:rPr>
+                <w:lang w:val="pt-BR"/>
+              </w:rPr>
+            </w:pPr>
+          </w:p>
+          <w:p>
+            <w:pPr>
+              <w:pStyle w:val="ListBullet"/>
+              <w:numPr>
+                <w:ilvl w:val="0"/>
+                <w:numId w:val="0"/>
+              </w:numPr>
+              <w:ind w:left="360"/>
+              <w:rPr>
+                <w:lang w:val="pt-BR"/>
+              </w:rPr>
+            </w:pPr>
+          </w:p>
+          <w:p>
+            <w:pPr>
+              <w:pStyle w:val="ListBullet"/>
+              <w:rPr>
+                <w:lang w:val="pt-BR"/>
+              </w:rPr>
+            </w:pPr>
+            <w:r>
+              <w:rPr>
+                <w:lang w:val="pt-BR"/>
+              </w:rPr>
+              <w:t>Familiaridade com o software Creo Parametric para projetos mecânicos 2D e 3D.</w:t>
+            </w:r>
+          </w:p>
+          <w:p>
+            <w:pPr>
+              <w:pStyle w:val="ListBullet"/>
+              <w:rPr>
+                <w:lang w:val="pt-BR"/>
+              </w:rPr>
+            </w:pPr>
+            <w:r>
+              <w:rPr>
+                <w:lang w:val="pt-BR"/>
+              </w:rPr>
+              <w:t>Experiência com alguns softwares de sistemas de supervisão.</w:t>
+            </w:r>
+          </w:p>
+        </w:tc>
+      </w:tr>
+      <w:tr>
+        <w:trPr>
+          <w:trHeight w:val="658"/>
+        </w:trPr>
+        <w:tc>
+          <w:tcPr>
+            <w:tcW w:w="5040" w:type="dxa"/>
+            <w:tcBorders>
+              <w:top w:val="single" w:sz="24" w:space="0" w:color="ACA8AA" w:themeColor="accent4"/>
+              <w:bottom w:val="single" w:sz="24" w:space="0" w:color="ACA8AA" w:themeColor="accent4"/>
+            </w:tcBorders>
+          </w:tcPr>
+          <w:p>
+            <w:pPr>
+              <w:pStyle w:val="ListBullet"/>
+              <w:numPr>
+                <w:ilvl w:val="0"/>
+                <w:numId w:val="0"/>
+              </w:numPr>
+              <w:ind w:left="360" w:hanging="360"/>
+              <w:rPr>
+                <w:rFonts w:asciiTheme="majorHAnsi" w:hAnsiTheme="majorHAnsi"/>
+                <w:caps/>
+                <w:color w:val="595959" w:themeColor="text1" w:themeTint="A6"/>
+                <w:lang w:val="pt-BR"/>
+              </w:rPr>
+            </w:pPr>
+            <w:r>
+              <w:rPr>
+                <w:rFonts w:asciiTheme="majorHAnsi" w:hAnsiTheme="majorHAnsi"/>
+                <w:caps/>
+                <w:color w:val="595959" w:themeColor="text1" w:themeTint="A6"/>
+                <w:lang w:val="pt-BR"/>
+              </w:rPr>
+              <w:t>Competências Complementares</w:t>
+            </w:r>
+          </w:p>
+          <w:p>
+            <w:pPr>
+              <w:pStyle w:val="ListBullet"/>
+              <w:rPr>
+                <w:lang w:val="pt-BR"/>
+              </w:rPr>
+            </w:pPr>
+            <w:r>
+              <w:rPr>
+                <w:lang w:val="pt-BR"/>
+              </w:rPr>
+              <w:t>Boa capacidade de t</w:t>
+            </w:r>
+            <w:r>
+              <w:rPr>
+                <w:lang w:val="pt-BR"/>
+              </w:rPr>
+              <w:t>rabalho em equipe.</w:t>
+            </w:r>
+          </w:p>
+          <w:p>
+            <w:pPr>
+              <w:pStyle w:val="ListBullet"/>
+              <w:rPr>
+                <w:lang w:val="pt-BR"/>
+              </w:rPr>
+            </w:pPr>
+            <w:r>
+              <w:rPr>
+                <w:lang w:val="pt-BR"/>
+              </w:rPr>
+              <w:t>Familiaridade com o pacote Office</w:t>
+            </w:r>
+            <w:r>
+              <w:rPr>
+                <w:lang w:val="pt-BR"/>
+              </w:rPr>
+              <w:t xml:space="preserve">, incluindo extensa experiência com a ferramenta </w:t>
+            </w:r>
+            <w:r>
+              <w:rPr>
+                <w:lang w:val="pt-BR"/>
+              </w:rPr>
+              <w:t>Excel</w:t>
+            </w:r>
+            <w:r>
+              <w:rPr>
+                <w:lang w:val="pt-BR"/>
+              </w:rPr>
+              <w:t>.</w:t>
+            </w:r>
+          </w:p>
+        </w:tc>
+        <w:tc>
+          <w:tcPr>
+            <w:tcW w:w="5040" w:type="dxa"/>
+            <w:tcBorders>
+              <w:top w:val="single" w:sz="24" w:space="0" w:color="ACA8AA" w:themeColor="accent4"/>
+              <w:bottom w:val="single" w:sz="24" w:space="0" w:color="ACA8AA" w:themeColor="accent4"/>
+            </w:tcBorders>
+          </w:tcPr>
+          <w:p>
+            <w:pPr>
+              <w:pStyle w:val="ListBullet"/>
+              <w:numPr>
+                <w:ilvl w:val="0"/>
+                <w:numId w:val="0"/>
+              </w:numPr>
+              <w:ind w:left="360"/>
+              <w:rPr>
+                <w:lang w:val="pt-BR"/>
+              </w:rPr>
+            </w:pPr>
+          </w:p>
+          <w:p>
+            <w:pPr>
+              <w:pStyle w:val="ListBullet"/>
+              <w:rPr>
+                <w:lang w:val="pt-BR"/>
+              </w:rPr>
+            </w:pPr>
+            <w:r>
+              <w:rPr>
+                <w:lang w:val="pt-BR"/>
+              </w:rPr>
+              <w:t>Boa comunicação.</w:t>
+            </w:r>
+          </w:p>
+          <w:p>
+            <w:pPr>
+              <w:pStyle w:val="ListBullet"/>
+              <w:rPr>
+                <w:lang w:val="pt-BR"/>
+              </w:rPr>
+            </w:pPr>
+            <w:r>
+              <w:rPr>
+                <w:lang w:val="pt-BR"/>
+              </w:rPr>
+              <w:t>Excelente organização.</w:t>
+            </w:r>
+          </w:p>
+          <w:p>
+            <w:pPr>
+              <w:pStyle w:val="ListBullet"/>
+              <w:rPr>
+                <w:lang w:val="pt-BR"/>
+              </w:rPr>
+            </w:pPr>
+            <w:r>
+              <w:rPr>
+                <w:lang w:val="pt-BR"/>
+              </w:rPr>
+              <w:t>Capacidade de buscar conhecimentos necessários em manuais e descritivos técnicos.</w:t>
             </w:r>
           </w:p>
         </w:tc>
@@ -1446,7 +1674,7 @@
   <w:abstractNum w:abstractNumId="0" w15:restartNumberingAfterBreak="0">
     <w:nsid w:val="FFFFFF89"/>
     <w:multiLevelType w:val="singleLevel"/>
-    <w:tmpl w:val="F29CCF44"/>
+    <w:tmpl w:val="DF54511C"/>
     <w:lvl w:ilvl="0">
       <w:start w:val="1"/>
       <w:numFmt w:val="bullet"/>
@@ -2839,35 +3067,6 @@
 </file>
 
 <file path=customXml/item1.xml><?xml version="1.0" encoding="utf-8"?>
-<p:properties xmlns:p="http://schemas.microsoft.com/office/2006/metadata/properties" xmlns:xsi="http://www.w3.org/2001/XMLSchema-instance" xmlns:pc="http://schemas.microsoft.com/office/infopath/2007/PartnerControls">
-  <documentManagement>
-    <_ip_UnifiedCompliancePolicyUIAction xmlns="http://schemas.microsoft.com/sharepoint/v3" xsi:nil="true"/>
-    <Image xmlns="71af3243-3dd4-4a8d-8c0d-dd76da1f02a5">
-      <Url xsi:nil="true"/>
-      <Description xsi:nil="true"/>
-    </Image>
-    <Status xmlns="71af3243-3dd4-4a8d-8c0d-dd76da1f02a5">Not started</Status>
-    <Background xmlns="71af3243-3dd4-4a8d-8c0d-dd76da1f02a5">false</Background>
-    <_ip_UnifiedCompliancePolicyProperties xmlns="http://schemas.microsoft.com/sharepoint/v3" xsi:nil="true"/>
-    <ImageTagsTaxHTField xmlns="71af3243-3dd4-4a8d-8c0d-dd76da1f02a5">
-      <Terms xmlns="http://schemas.microsoft.com/office/infopath/2007/PartnerControls"/>
-    </ImageTagsTaxHTField>
-    <TaxCatchAll xmlns="230e9df3-be65-4c73-a93b-d1236ebd677e" xsi:nil="true"/>
-    <MediaServiceKeyPoints xmlns="71af3243-3dd4-4a8d-8c0d-dd76da1f02a5" xsi:nil="true"/>
-  </documentManagement>
-</p:properties>
-</file>
-
-<file path=customXml/item2.xml><?xml version="1.0" encoding="utf-8"?>
-<?mso-contentType ?>
-<FormTemplates xmlns="http://schemas.microsoft.com/sharepoint/v3/contenttype/forms">
-  <Display>DocumentLibraryForm</Display>
-  <Edit>DocumentLibraryForm</Edit>
-  <New>DocumentLibraryForm</New>
-</FormTemplates>
-</file>
-
-<file path=customXml/item3.xml><?xml version="1.0" encoding="utf-8"?>
 <ct:contentTypeSchema xmlns:ct="http://schemas.microsoft.com/office/2006/metadata/contentType" xmlns:ma="http://schemas.microsoft.com/office/2006/metadata/properties/metaAttributes" ct:_="" ma:_="" ma:contentTypeName="Document" ma:contentTypeID="0x01010079F111ED35F8CC479449609E8A0923A6" ma:contentTypeVersion="29" ma:contentTypeDescription="Create a new document." ma:contentTypeScope="" ma:versionID="6a914531ae0f23be31da2eba1f3b42a9">
   <xsd:schema xmlns:xsd="http://www.w3.org/2001/XMLSchema" xmlns:xs="http://www.w3.org/2001/XMLSchema" xmlns:p="http://schemas.microsoft.com/office/2006/metadata/properties" xmlns:ns1="http://schemas.microsoft.com/sharepoint/v3" xmlns:ns2="71af3243-3dd4-4a8d-8c0d-dd76da1f02a5" xmlns:ns3="16c05727-aa75-4e4a-9b5f-8a80a1165891" xmlns:ns4="230e9df3-be65-4c73-a93b-d1236ebd677e" targetNamespace="http://schemas.microsoft.com/office/2006/metadata/properties" ma:root="true" ma:fieldsID="ae00154c9e66547f022c4923f88826d6" ns1:_="" ns2:_="" ns3:_="" ns4:_="">
     <xsd:import namespace="http://schemas.microsoft.com/sharepoint/v3"/>
@@ -3179,27 +3378,36 @@
 </ct:contentTypeSchema>
 </file>
 
-<file path=customXml/itemProps1.xml><?xml version="1.0" encoding="utf-8"?>
-<ds:datastoreItem xmlns:ds="http://schemas.openxmlformats.org/officeDocument/2006/customXml" ds:itemID="{CE6918B0-4900-4A50-93ED-CE0C9D50CFD6}">
-  <ds:schemaRefs>
-    <ds:schemaRef ds:uri="http://schemas.microsoft.com/office/2006/metadata/properties"/>
-    <ds:schemaRef ds:uri="http://schemas.microsoft.com/office/infopath/2007/PartnerControls"/>
-    <ds:schemaRef ds:uri="http://schemas.microsoft.com/sharepoint/v3"/>
-    <ds:schemaRef ds:uri="71af3243-3dd4-4a8d-8c0d-dd76da1f02a5"/>
-    <ds:schemaRef ds:uri="230e9df3-be65-4c73-a93b-d1236ebd677e"/>
-  </ds:schemaRefs>
-</ds:datastoreItem>
+<file path=customXml/item2.xml><?xml version="1.0" encoding="utf-8"?>
+<?mso-contentType ?>
+<FormTemplates xmlns="http://schemas.microsoft.com/sharepoint/v3/contenttype/forms">
+  <Display>DocumentLibraryForm</Display>
+  <Edit>DocumentLibraryForm</Edit>
+  <New>DocumentLibraryForm</New>
+</FormTemplates>
 </file>
 
-<file path=customXml/itemProps2.xml><?xml version="1.0" encoding="utf-8"?>
-<ds:datastoreItem xmlns:ds="http://schemas.openxmlformats.org/officeDocument/2006/customXml" ds:itemID="{6AE9180F-347B-4BDE-8CBF-50126570E421}">
-  <ds:schemaRefs>
-    <ds:schemaRef ds:uri="http://schemas.microsoft.com/sharepoint/v3/contenttype/forms"/>
-  </ds:schemaRefs>
-</ds:datastoreItem>
+<file path=customXml/item3.xml><?xml version="1.0" encoding="utf-8"?>
+<p:properties xmlns:p="http://schemas.microsoft.com/office/2006/metadata/properties" xmlns:xsi="http://www.w3.org/2001/XMLSchema-instance" xmlns:pc="http://schemas.microsoft.com/office/infopath/2007/PartnerControls">
+  <documentManagement>
+    <_ip_UnifiedCompliancePolicyUIAction xmlns="http://schemas.microsoft.com/sharepoint/v3" xsi:nil="true"/>
+    <Image xmlns="71af3243-3dd4-4a8d-8c0d-dd76da1f02a5">
+      <Url xsi:nil="true"/>
+      <Description xsi:nil="true"/>
+    </Image>
+    <Status xmlns="71af3243-3dd4-4a8d-8c0d-dd76da1f02a5">Not started</Status>
+    <Background xmlns="71af3243-3dd4-4a8d-8c0d-dd76da1f02a5">false</Background>
+    <_ip_UnifiedCompliancePolicyProperties xmlns="http://schemas.microsoft.com/sharepoint/v3" xsi:nil="true"/>
+    <ImageTagsTaxHTField xmlns="71af3243-3dd4-4a8d-8c0d-dd76da1f02a5">
+      <Terms xmlns="http://schemas.microsoft.com/office/infopath/2007/PartnerControls"/>
+    </ImageTagsTaxHTField>
+    <TaxCatchAll xmlns="230e9df3-be65-4c73-a93b-d1236ebd677e" xsi:nil="true"/>
+    <MediaServiceKeyPoints xmlns="71af3243-3dd4-4a8d-8c0d-dd76da1f02a5" xsi:nil="true"/>
+  </documentManagement>
+</p:properties>
 </file>
 
-<file path=customXml/itemProps3.xml><?xml version="1.0" encoding="utf-8"?>
+<file path=customXml/itemProps1.xml><?xml version="1.0" encoding="utf-8"?>
 <ds:datastoreItem xmlns:ds="http://schemas.openxmlformats.org/officeDocument/2006/customXml" ds:itemID="{0F4C0447-40FA-4FFB-9968-E3A633FE9D3F}">
   <ds:schemaRefs>
     <ds:schemaRef ds:uri="http://schemas.microsoft.com/office/2006/metadata/contentType"/>
@@ -3220,6 +3428,26 @@
 </ds:datastoreItem>
 </file>
 
+<file path=customXml/itemProps2.xml><?xml version="1.0" encoding="utf-8"?>
+<ds:datastoreItem xmlns:ds="http://schemas.openxmlformats.org/officeDocument/2006/customXml" ds:itemID="{6AE9180F-347B-4BDE-8CBF-50126570E421}">
+  <ds:schemaRefs>
+    <ds:schemaRef ds:uri="http://schemas.microsoft.com/sharepoint/v3/contenttype/forms"/>
+  </ds:schemaRefs>
+</ds:datastoreItem>
+</file>
+
+<file path=customXml/itemProps3.xml><?xml version="1.0" encoding="utf-8"?>
+<ds:datastoreItem xmlns:ds="http://schemas.openxmlformats.org/officeDocument/2006/customXml" ds:itemID="{CE6918B0-4900-4A50-93ED-CE0C9D50CFD6}">
+  <ds:schemaRefs>
+    <ds:schemaRef ds:uri="http://schemas.microsoft.com/office/2006/metadata/properties"/>
+    <ds:schemaRef ds:uri="http://schemas.microsoft.com/office/infopath/2007/PartnerControls"/>
+    <ds:schemaRef ds:uri="http://schemas.microsoft.com/sharepoint/v3"/>
+    <ds:schemaRef ds:uri="71af3243-3dd4-4a8d-8c0d-dd76da1f02a5"/>
+    <ds:schemaRef ds:uri="230e9df3-be65-4c73-a93b-d1236ebd677e"/>
+  </ds:schemaRefs>
+</ds:datastoreItem>
+</file>
+
 <file path=docMetadata/LabelInfo.xml><?xml version="1.0" encoding="utf-8"?>
 <clbl:labelList xmlns:clbl="http://schemas.microsoft.com/office/2020/mipLabelMetadata"/>
 </file>
</xml_diff>